<commit_message>
Describe duplicate review with adjudication; note excluded-report list
State that screening, extraction, and appraisal were done independently by
two reviewers with disagreements adjudicated by the third and fourth
authors; point PRISMA item 16b to the excluded-report list on request.

Co-Authored-By: Claude Opus 5.5 <noreply@anthropic.com>
Claude-Session: https://claude.ai/code/session_01XhsrtZoNnNZHM2jxbhbhEo
</commit_message>
<xml_diff>
--- a/submission/1_Manuscript_Healthcare.docx
+++ b/submission/1_Manuscript_Healthcare.docx
@@ -1032,7 +1032,7 @@
         <w:pStyle w:val="MDPI31text"/>
       </w:pPr>
       <w:r>
-        <w:t xml:space="preserve">Duplicate records were identified and removed before screening. Screening was carried out in two stages, titles and abstracts followed by full texts, against the prespecified eligibility criteria. At each stage, one reviewer (M.S.A.) made the initial decision, and all decisions, including the principal reason assigned to each full-text exclusion, were verified by the other three authors (M.I.E.-K.G., A.K.D., and M.A.S.). Disagreements were resolved by discussion among all four authors until consensus was reached, and all eligibility decisions were made by the reviewers. Full-text exclusions were assigned one principal reason according to a prespecified hierarchy: population or target condition not glaucoma-specific; no eligible transformer; ineligible task or outcome; secondary or non-original report; conference paper, preprint, or thesis; no glaucoma-specific result; and duplicate or overlapping report. The selection process is shown in Figure 1, and exclusion reasons are summarised in Table S2.</w:t>
+        <w:t xml:space="preserve">Duplicate records were identified and removed before screening. Screening was carried out in two stages, titles and abstracts followed by full texts, against the prespecified eligibility criteria. At both stages, two reviewers (M.S.A. and M.I.E.-K.G.) independently assessed every record and report. Disagreements, including disagreements about the principal reason for full-text exclusion, were referred to the third and fourth authors (A.K.D. and M.A.S.), who re-checked the source record or full text and resolved the disagreement with the two reviewers by consensus. All eligibility decisions were made by the reviewers. Full-text exclusions were assigned one principal reason according to a prespecified hierarchy: population or target condition not glaucoma-specific; no eligible transformer; ineligible task or outcome; secondary or non-original report; conference paper, preprint, or thesis; no glaucoma-specific result; and duplicate or overlapping report. The selection process is shown in Figure 1, and exclusion reasons are summarised in Table S2; the individual excluded reports and their reasons are available from the corresponding author.</w:t>
       </w:r>
     </w:p>
     <w:p>
@@ -1049,7 +1049,7 @@
         <w:pStyle w:val="MDPI31text"/>
       </w:pPr>
       <w:r>
-        <w:t xml:space="preserve">Data were extracted from the published reports into a structured form by one reviewer and verified field by field against each source report by the other three authors, with discrepancies resolved by consensus. Extracted items were publication characteristics; country and data source; participant, eye, examination, volume, or image denominators and the unit of analysis; imaging modality; dataset provenance and recurring dataset family; architecture and fusion strategy; diagnostic or staging task; reference standard and label source; early-disease definition; data partitioning and separation level; validation design; discrimination and classification metrics with confidence intervals; explicit imaging biomarkers or clinically interpretable feature pathways; explanation methods; and internal inconsistencies or material reporting limitations.</w:t>
+        <w:t xml:space="preserve">Data were extracted from the published reports into a structured form independently by two reviewers (M.S.A. and M.I.E.-K.G.). Their extractions were compared field by field, and any discrepancy was re-checked against the source report by the third and fourth authors (A.K.D. and M.A.S.) and resolved by consensus. Extracted items were publication characteristics; country and data source; participant, eye, examination, volume, or image denominators and the unit of analysis; imaging modality; dataset provenance and recurring dataset family; architecture and fusion strategy; diagnostic or staging task; reference standard and label source; early-disease definition; data partitioning and separation level; validation design; discrimination and classification metrics with confidence intervals; explicit imaging biomarkers or clinically interpretable feature pathways; explanation methods; and internal inconsistencies or material reporting limitations.</w:t>
       </w:r>
     </w:p>
     <w:p>
@@ -1159,7 +1159,7 @@
         <w:pStyle w:val="MDPI31text"/>
       </w:pPr>
       <w:r>
-        <w:t xml:space="preserve">PROBAST+AI judgements were made separately for model-development quality and for risk of bias in model evaluation across four domains: participants and data sources, predictors, outcome, and analysis. Applicability of the evaluation evidence to the prespecified intended use, the detection or triage of current glaucoma from ONH or retinal imaging, was assessed across the participants and data sources, predictors, and outcome domains. Each domain was rated low, high, or unclear with a report-specific rationale. The overall judgement was high when any domain was high, low only when all domains were low, and unclear otherwise; no numerical quality score was calculated. Appraisal followed the same procedure as data extraction: one reviewer made the initial judgements, which were verified by the other three authors, and disagreements were resolved by consensus. Study-level judgements are reported in Table S7.</w:t>
+        <w:t xml:space="preserve">PROBAST+AI judgements were made separately for model-development quality and for risk of bias in model evaluation across four domains: participants and data sources, predictors, outcome, and analysis. Applicability of the evaluation evidence to the prespecified intended use, the detection or triage of current glaucoma from ONH or retinal imaging, was assessed across the participants and data sources, predictors, and outcome domains. Each domain was rated low, high, or unclear with a report-specific rationale. The overall judgement was high when any domain was high, low only when all domains were low, and unclear otherwise; no numerical quality score was calculated. Appraisal followed the same procedure as data extraction: two reviewers (M.S.A. and M.I.E.-K.G.) independently rated every domain, and disagreements were re-checked by the third and fourth authors (A.K.D. and M.A.S.) and resolved by consensus. Study-level judgements are reported in Table S7.</w:t>
       </w:r>
     </w:p>
     <w:p>
@@ -5173,7 +5173,7 @@
         <w:pStyle w:val="MDPI31text"/>
       </w:pPr>
       <w:r>
-        <w:t xml:space="preserve">This review applied transformer-specific eligibility criteria, linked recurrent dataset families, separated early disease from suspect and surrogate states, and distinguished technical cross-dataset testing from clinical external validation. It appraised development quality, evaluation risk of bias, and applicability separately; verified every screening decision, extracted field, and appraisal judgement across all four authors; avoided pooling non-exchangeable estimates; and distinguished anatomical biomarkers from post hoc explanations. All report-level data and judgements are provided in the Supplementary Materials, making the synthesis fully auditable.</w:t>
+        <w:t xml:space="preserve">This review applied transformer-specific eligibility criteria, linked recurrent dataset families, separated early disease from suspect and surrogate states, and distinguished technical cross-dataset testing from clinical external validation. It appraised development quality, evaluation risk of bias, and applicability separately; performed screening, data extraction, and appraisal independently in duplicate, with disagreements adjudicated by two further authors; avoided pooling non-exchangeable estimates; and distinguished anatomical biomarkers from post hoc explanations. All report-level data and judgements are provided in the Supplementary Materials, making the synthesis fully auditable.</w:t>
       </w:r>
     </w:p>
     <w:p>
@@ -5227,7 +5227,7 @@
         <w:t xml:space="preserve">Author Contributions: </w:t>
       </w:r>
       <w:r>
-        <w:t xml:space="preserve">Conceptualization, M.S.A. and M.I.E.-K.G.; methodology, M.S.A., M.I.E.-K.G., A.K.D. and M.A.S.; investigation, M.S.A., M.I.E.-K.G., A.K.D. and M.A.S.; data curation, M.S.A.; validation, M.I.E.-K.G., A.K.D. and M.A.S.; formal analysis, M.S.A. and M.I.E.-K.G.; visualization, M.S.A.; writing—original draft preparation, M.S.A.; writing—review and editing, M.I.E.-K.G., A.K.D. and M.A.S.; supervision, M.I.E.-K.G.; project administration, M.I.E.-K.G.; funding acquisition, M.I.E.-K.G. and A.K.D. All authors have read and agreed to the published version of the manuscript.</w:t>
+        <w:t xml:space="preserve">Conceptualization, M.S.A. and M.I.E.-K.G.; methodology, M.S.A., M.I.E.-K.G., A.K.D. and M.A.S.; investigation, M.S.A. and M.I.E.-K.G.; data curation, M.S.A. and M.I.E.-K.G.; validation, A.K.D. and M.A.S.; formal analysis, M.S.A. and M.I.E.-K.G.; visualization, M.S.A.; writing—original draft preparation, M.S.A.; writing—review and editing, M.I.E.-K.G., A.K.D. and M.A.S.; supervision, M.I.E.-K.G.; project administration, M.I.E.-K.G.; funding acquisition, M.I.E.-K.G. and A.K.D. All authors have read and agreed to the published version of the manuscript.</w:t>
       </w:r>
     </w:p>
     <w:p>
@@ -5287,7 +5287,7 @@
         <w:t xml:space="preserve">Data Availability Statement: </w:t>
       </w:r>
       <w:r>
-        <w:t xml:space="preserve">All report-level extracted data, harmonised definitions, validation tiers, and PROBAST+AI judgements with rationales are provided in the Supplementary Materials (Tables S1–S7). A machine-readable version of the extraction dataset is available from the corresponding author on reasonable request.</w:t>
+        <w:t xml:space="preserve">All report-level extracted data, harmonised definitions, validation tiers, and PROBAST+AI judgements with rationales are provided in the Supplementary Materials (Tables S1–S7). A machine-readable version of the extraction dataset and the list of individual reports excluded at full-text assessment, with the reason for each exclusion, are available from the corresponding author on reasonable request.</w:t>
       </w:r>
     </w:p>
     <w:p>

</xml_diff>

<commit_message>
Address pre-submission review concerns
Define diagnostic-detection and population-screening uses and report
screening applicability; separate extractable from credible early-disease
estimates; document the glaucoma-specific eligibility basis for every
report with a denominator sensitivity analysis (Table S8); engage recent
glaucoma AI reviews; list post hoc amendments and the PROSPERO address;
make PRISMA entries state actual reporting status; relabel Figure 3;
clarify Table 4 is hypothetical; remove template placeholders.

Co-Authored-By: Claude Opus 5.5 <noreply@anthropic.com>
Claude-Session: https://claude.ai/code/session_01XhsrtZoNnNZHM2jxbhbhEo
</commit_message>
<xml_diff>
--- a/submission/1_Manuscript_Healthcare.docx
+++ b/submission/1_Manuscript_Healthcare.docx
@@ -62,119 +62,6 @@
         <w:t xml:space="preserve">5,6</w:t>
       </w:r>
     </w:p>
-    <w:tbl>
-      <w:tblPr>
-        <w:tblpPr w:leftFromText="198" w:rightFromText="198" w:vertAnchor="page" w:horzAnchor="margin" w:tblpY="11461"/>
-        <w:tblW w:w="2410" w:type="dxa"/>
-        <w:tblLayout w:type="fixed"/>
-        <w:tblCellMar>
-          <w:left w:w="0" w:type="dxa"/>
-          <w:right w:w="0" w:type="dxa"/>
-        </w:tblCellMar>
-        <w:tblLook w:val="04A0" w:firstRow="1" w:lastRow="0" w:firstColumn="1" w:lastColumn="0" w:noHBand="0" w:noVBand="1"/>
-      </w:tblPr>
-      <w:tblGrid>
-        <w:gridCol w:w="2410"/>
-      </w:tblGrid>
-      <w:tr>
-        <w:tc>
-          <w:tcPr>
-            <w:tcW w:w="2410" w:type="dxa"/>
-          </w:tcPr>
-          <w:p>
-            <w:pPr>
-              <w:pStyle w:val="MDPI15academiceditor"/>
-              <w:spacing w:before="0" w:after="120"/>
-            </w:pPr>
-            <w:r>
-              <w:t>Academic Editor: Firstname Lastname</w:t>
-            </w:r>
-          </w:p>
-          <w:p>
-            <w:pPr>
-              <w:pStyle w:val="MDPI14history"/>
-              <w:spacing w:before="120"/>
-            </w:pPr>
-            <w:r>
-              <w:t>Received: date</w:t>
-            </w:r>
-          </w:p>
-          <w:p>
-            <w:pPr>
-              <w:pStyle w:val="MDPI14history"/>
-            </w:pPr>
-            <w:r>
-              <w:t>Revised: date</w:t>
-            </w:r>
-          </w:p>
-          <w:p>
-            <w:pPr>
-              <w:pStyle w:val="MDPI14history"/>
-            </w:pPr>
-            <w:r>
-              <w:t>Accepted: date</w:t>
-            </w:r>
-          </w:p>
-          <w:p>
-            <w:pPr>
-              <w:pStyle w:val="MDPI14history"/>
-              <w:spacing w:after="120"/>
-            </w:pPr>
-            <w:r>
-              <w:t>Published: date</w:t>
-            </w:r>
-          </w:p>
-          <w:p>
-            <w:pPr>
-              <w:pStyle w:val="MDPI61citation"/>
-              <w:rPr>
-                <w:lang w:bidi="en-US"/>
-              </w:rPr>
-            </w:pPr>
-            <w:r>
-              <w:rPr>
-                <w:b/>
-                <w:lang w:bidi="en-US"/>
-              </w:rPr>
-              <w:t xml:space="preserve">Citation: </w:t>
-            </w:r>
-            <w:r>
-              <w:rPr>
-                <w:lang w:bidi="en-US"/>
-              </w:rPr>
-              <w:t>To be added by editorial staff during production.</w:t>
-            </w:r>
-          </w:p>
-          <w:p>
-            <w:pPr>
-              <w:pStyle w:val="MDPI72copyright"/>
-              <w:rPr>
-                <w:rFonts w:eastAsia="DengXian"/>
-                <w:noProof w:val="0"/>
-                <w:lang w:val="en-US" w:bidi="en-US"/>
-              </w:rPr>
-            </w:pPr>
-            <w:r>
-              <w:rPr>
-                <w:rFonts w:eastAsia="DengXian"/>
-                <w:b/>
-                <w:noProof w:val="0"/>
-                <w:lang w:val="en-US" w:bidi="en-US"/>
-              </w:rPr>
-              <w:t>Copyright:</w:t>
-            </w:r>
-            <w:r>
-              <w:rPr>
-                <w:rFonts w:eastAsia="DengXian"/>
-                <w:noProof w:val="0"/>
-                <w:lang w:val="en-US" w:bidi="en-US"/>
-              </w:rPr>
-              <w:t xml:space="preserve"> © 2026 by the authors. Submitted for possible open access publication under the terms and conditions of the Creative Commons Attribution (CC BY) license (https://creativecommons.org/licenses/by/4.0/).</w:t>
-            </w:r>
-          </w:p>
-        </w:tc>
-      </w:tr>
-    </w:tbl>
     <w:p>
       <w:pPr>
         <w:pStyle w:val="MDPI16affiliation"/>
@@ -315,7 +202,7 @@
         <w:spacing w:before="60"/>
       </w:pPr>
       <w:r>
-        <w:t xml:space="preserve">Of 55 transformer-based glaucoma imaging studies, only 8 separated data at the participant level, 9 tested models on a distinct data source, and 3 had both low risk of bias and low applicability concern.</w:t>
+        <w:t xml:space="preserve">Of 55 transformer-based glaucoma imaging studies, only 8 separated data at the participant level and 9 tested models on a distinct data source; none evaluated a model in a population-screening sample or pathway.</w:t>
       </w:r>
     </w:p>
     <w:p>
@@ -328,7 +215,7 @@
         <w:spacing w:before="60"/>
       </w:pPr>
       <w:r>
-        <w:t xml:space="preserve">No study reported a separately extractable result for preperimetric glaucoma, and no explanation map was independently validated as a glaucoma biomarker.</w:t>
+        <w:t xml:space="preserve">Only one early-glaucoma estimate was credible for clinical inference, no study reported a preperimetric result, and no explanation map was independently validated as a glaucoma biomarker.</w:t>
       </w:r>
     </w:p>
     <w:p>
@@ -354,7 +241,7 @@
         <w:spacing w:before="60"/>
       </w:pPr>
       <w:r>
-        <w:t xml:space="preserve">High benchmark accuracy is not evidence of screening readiness: at population prevalence, even a highly specific model would generate more false-positive than true-positive referrals.</w:t>
+        <w:t xml:space="preserve">High benchmark accuracy is not evidence of screening readiness: in a hypothetical calculation at population prevalence, a model with 90% sensitivity and 95% specificity would generate more false-positive than true-positive referrals.</w:t>
       </w:r>
     </w:p>
     <w:p>
@@ -394,7 +281,7 @@
         <w:t xml:space="preserve">Background/Objectives:</w:t>
       </w:r>
       <w:r>
-        <w:t xml:space="preserve"> Transformer-based artificial intelligence (AI) models report very high accuracy for detecting glaucoma from retinal images, raising expectations of automated screening. Whether this evidence supports clinical or public-health use is unknown. We assessed the validation rigour, early-disease evidence, and risk of bias of transformer-based glaucoma detection studies. </w:t>
+        <w:t xml:space="preserve"> Transformer-based artificial intelligence (AI) models report very high accuracy for detecting glaucoma from retinal images, but whether this evidence supports screening is unknown. We assessed validation rigour, early-disease evidence, and risk of bias in this literature. </w:t>
       </w:r>
       <w:r>
         <w:rPr>
@@ -403,7 +290,7 @@
         <w:t xml:space="preserve">Methods:</w:t>
       </w:r>
       <w:r>
-        <w:t xml:space="preserve"> Following a PROSPERO-registered protocol (CRD420261504931) and PRISMA 2020, we searched PubMed/MEDLINE, Embase, Scopus, Web of Science, and IEEE Xplore from January 2017 to 15 July 2026, supplemented by Google Scholar and citation searching. Peer-reviewed reports applying transformer architectures to fundus, optic nerve head, or optical coherence tomography images for glaucoma detection or staging were eligible. Risk of bias and applicability were assessed with PROBAST+AI. Heterogeneity and dataset reuse precluded meta-analysis; a structured narrative synthesis was performed. </w:t>
+        <w:t xml:space="preserve"> Following a PROSPERO-registered protocol (CRD420261504931) and PRISMA 2020, we searched PubMed/MEDLINE, Embase, Scopus, Web of Science, and IEEE Xplore from January 2017 to 15 July 2026, plus Google Scholar and citation searching. We included peer-reviewed reports applying transformers to fundus, optic nerve head, or optical coherence tomography images for glaucoma detection or staging. Risk of bias and applicability were assessed with PROBAST+AI. Heterogeneity and dataset reuse precluded meta-analysis, so results were synthesised narratively. </w:t>
       </w:r>
       <w:r>
         <w:rPr>
@@ -412,7 +299,7 @@
         <w:t xml:space="preserve">Results:</w:t>
       </w:r>
       <w:r>
-        <w:t xml:space="preserve"> Fifty-five reports were included; 42 (76.4%) were published in 2025–2026, and 53 (96.4%) used fundus photographs. Only 8 (14.5%) confirmed participant-level data separation, 9 (16.4%) evaluated models on a distinct data source, and 38 (69.1%) relied on inherited, mixed-repository, or surrogate labels. Six reports operationalised mild/early perimetric glaucoma, two reported interpretable early-disease discrimination, and none reported preperimetric performance. In one comparison, internal areas under the curve of 0.94–0.96 fell to 0.56–0.63 on external data. Risk of bias was high in 51 reports (92.7%); only three combined low risk of bias with low applicability concern. </w:t>
+        <w:t xml:space="preserve"> Fifty-five reports were included; 42 (76.4%) were published in 2025–2026, and 53 (96.4%) used fundus photographs. Only 8 (14.5%) confirmed participant-level data separation, 9 (16.4%) evaluated models on a distinct data source, and 38 (69.1%) relied on inherited, mixed-repository, or surrogate labels. Six reports operationalised mild/early perimetric glaucoma; two provided an extractable early-disease estimate, of which one was credible for clinical inference, and none reported preperimetric performance. In one comparison, internal areas under the curve of 0.94–0.96 fell to 0.56–0.63 externally. Risk of bias was high in 51 reports (92.7%). Three had low risk of bias and low applicability concern for diagnostic detection, but none evaluated a screening population or pathway. </w:t>
       </w:r>
       <w:r>
         <w:rPr>
@@ -488,7 +375,7 @@
         <w:pStyle w:val="MDPI31text"/>
       </w:pPr>
       <w:r>
-        <w:t xml:space="preserve">Previous systematic reviews of AI for glaucoma have pooled diverse architectures, modalities, disease stages, and reference standards, reporting high summary accuracy [23], while a recent assessment found persistent deficiencies in how glaucoma AI studies are reported [24]. No review has examined whether the transformer literature, which has expanded rapidly since 2023, provides evidence that is fit for clinical or screening decisions. We therefore conducted a systematic review of transformer-based glaucoma detection and staging from ONH and retinal imaging with five objectives: to determine (1) how glaucoma, and particularly early disease, was defined; (2) which reference standards were used; (3) how models were validated, including participant-level separation and independence of test data; (4) which imaging biomarkers and explanation methods were represented; and (5) the risk of bias and applicability of the evidence to screening and triage. Rather than generate a potentially misleading pooled accuracy estimate, we aimed to establish how close this literature is to clinical readiness and what evidence is still required.</w:t>
+        <w:t xml:space="preserve">Recent reviews of AI for glaucoma have pooled diverse architectures, modalities, disease stages, and reference standards, reporting high summary accuracy [23]; have mapped deep-learning methods, public datasets, external testing, and explainability for fundus-based detection [24,25]; and have documented persistent deficiencies in how glaucoma AI studies are reported [26]. These reviews have already highlighted the scarcity of external validation and the limits of visual explanations. Our contribution is narrower. We focus on transformer-based models, which account for most recent publications, and ask whether their evidence is fit for screening decisions. To do so, we code validation independence at the report level, including participant-level separation and linkage of reused dataset families; distinguish operationally defined early disease from suspect and surrogate targets; appraise development and evaluation separately with PROBAST+AI; and assess applicability to a prespecified screening use. We therefore conducted a systematic review of transformer-based glaucoma detection and staging from ONH and retinal imaging with five objectives: to determine (1) how glaucoma, and particularly early disease, was defined; (2) which reference standards were used; (3) how models were validated, including participant-level separation and independence of test data; (4) which imaging biomarkers and explanation methods were represented; and (5) the risk of bias and applicability of the evidence to screening and triage. Rather than generate a potentially misleading pooled accuracy estimate, we aimed to establish how close this literature is to clinical readiness and what evidence is still required.</w:t>
       </w:r>
     </w:p>
     <w:p>
@@ -513,7 +400,7 @@
         <w:pStyle w:val="MDPI31text"/>
       </w:pPr>
       <w:r>
-        <w:t xml:space="preserve">This systematic review was conducted according to a prespecified protocol registered in PROSPERO (CRD420261504931). Reporting follows the Preferred Reporting Items for Systematic Reviews and Meta-Analyses (PRISMA) 2020 statement and its literature-search extension (PRISMA-S) and was informed by the checklist for systematic reviews of prediction models (TRIPOD-SRMA), PRISMA for diagnostic test accuracy (PRISMA-DTA), and Synthesis Without Meta-analysis (SWiM) guidance [25–29]. The completed PRISMA 2020 checklist is provided as a separate file. The review question was: among human eyes or participants evaluated for current glaucoma using ONH or retinal imaging, how have transformer-based models been developed and validated; how was glaucoma, particularly preperimetric or mild disease, defined; which imaging biomarkers were represented; and to what extent do the validation designs support image-based case detection and referral?</w:t>
+        <w:t xml:space="preserve">This systematic review was conducted according to a prespecified protocol registered in PROSPERO (CRD420261504931; the registered protocol is publicly available at https://www.crd.york.ac.uk/PROSPERO/view/CRD420261504931). Reporting follows the Preferred Reporting Items for Systematic Reviews and Meta-Analyses (PRISMA) 2020 statement and its literature-search extension (PRISMA-S) and was informed by the checklist for systematic reviews of prediction models (TRIPOD-SRMA), PRISMA for diagnostic test accuracy (PRISMA-DTA), and Synthesis Without Meta-analysis (SWiM) guidance [27–31]. The completed PRISMA 2020 checklist is provided as a separate file. The review question was: among human eyes or participants evaluated for current glaucoma using ONH or retinal imaging, how have transformer-based models been developed and validated; how was glaucoma, particularly preperimetric or mild disease, defined; which imaging biomarkers were represented; and to what extent do the validation designs support image-based case detection and referral?</w:t>
       </w:r>
     </w:p>
     <w:p>
@@ -521,7 +408,33 @@
         <w:pStyle w:val="MDPI31text"/>
       </w:pPr>
       <w:r>
-        <w:t xml:space="preserve">The intended clinical role was distinguished from the technical task. A model described by its authors as a screening model was not treated as screening evidence unless it had been evaluated in a population and workflow relevant to identifying previously undiagnosed disease. Retrospective discrimination in enriched case–control or public benchmark datasets was classified as technical diagnostic classification.</w:t>
+        <w:t xml:space="preserve">The intended clinical role was distinguished from the technical task. Two intended uses were distinguished. </w:t>
+      </w:r>
+      <w:r>
+        <w:rPr>
+          <w:i/>
+        </w:rPr>
+        <w:t xml:space="preserve">Diagnostic detection</w:t>
+      </w:r>
+      <w:r>
+        <w:t xml:space="preserve"> was defined as image-based identification of current glaucoma, versus no glaucoma, in people undergoing assessment in eye-care settings, with a specialist clinical diagnosis as the reference standard. </w:t>
+      </w:r>
+      <w:r>
+        <w:rPr>
+          <w:i/>
+        </w:rPr>
+        <w:t xml:space="preserve">Population screening</w:t>
+      </w:r>
+      <w:r>
+        <w:t xml:space="preserve"> was defined by four elements: the target population (adults without a known glaucoma diagnosis); the setting (primary care, optometry, community, or teleophthalmology programmes); the role of the test (a triage test applied before specialist examination); and the referral pathway (test-positive people referred for specialist assessment, test-negative people returned to routine care). A model described by its authors as a screening model was not treated as screening evidence unless it had been evaluated in a population and workflow matching this definition. Retrospective discrimination in enriched case–control or public benchmark datasets was classified as technical diagnostic classification.</w:t>
+      </w:r>
+    </w:p>
+    <w:p>
+      <w:pPr>
+        <w:pStyle w:val="MDPI31text"/>
+      </w:pPr>
+      <w:r>
+        <w:t xml:space="preserve">The following elements were added after protocol registration and are reported as post hoc amendments: (1) the explicit separation of the diagnostic-detection and population-screening uses, with an additional classification of screening applicability; (2) the distinction between extractable and credible early-disease estimates; (3) the sensitivity analysis of the report denominator; (4) the summary of individual and combined clinical-readiness criteria (Figure 3); and (5) the illustrative referral calculation (Table 4). These additions did not change the eligibility criteria, search, study selection, data extraction, or PROBAST+AI domain ratings.</w:t>
       </w:r>
     </w:p>
     <w:p>
@@ -546,7 +459,7 @@
         <w:pStyle w:val="MDPI31text"/>
       </w:pPr>
       <w:r>
-        <w:t xml:space="preserve">A transformer, or explicit transformer-type attention, had to be integral to the primary evaluated model. Eligible implementations included transformer encoders or decoders, Vision Transformer (ViT), DeiT, Swin Transformer, transformer-based foundation models, and architectures in which query–key–value scaled dot-product self-attention or cross-attention was a substantive representation or fusion mechanism. Generic attention gates and channel- or spatial-attention modules without such a mechanism were insufficient. Reports in which a transformer was only a comparator were eligible when transformer-specific glaucoma performance was extractable. Multidisease studies were retained when glaucoma was an explicit target class with a glaucoma-specific result. Segmentation studies were eligible only when disc, cup, or retinal-layer segmentation contributed to downstream glaucoma classification or grading.</w:t>
+        <w:t xml:space="preserve">A transformer, or explicit transformer-type attention, had to be integral to the primary evaluated model. Eligible implementations included transformer encoders or decoders, Vision Transformer (ViT), DeiT, Swin Transformer, transformer-based foundation models, and architectures in which query–key–value scaled dot-product self-attention or cross-attention was a substantive representation or fusion mechanism. Generic attention gates and channel- or spatial-attention modules without such a mechanism were insufficient. Reports in which a transformer was only a comparator were eligible when transformer-specific glaucoma performance was extractable. Multidisease studies were retained when glaucoma was an explicit target class with a glaucoma-specific result. The glaucoma-specific result criterion was met in one of two ways: (a) the evaluated task was glaucoma-only (binary glaucoma, glaucomatous optic neuropathy, or referable-glaucoma classification, or glaucoma staging), so that the task-level result was glaucoma-specific; or (b) in multidisease or multilabel studies, a result was reported for the glaucoma class. The basis on which each included report met this criterion is documented in Table S4. Segmentation studies were eligible only when disc, cup, or retinal-layer segmentation contributed to downstream glaucoma classification or grading.</w:t>
       </w:r>
     </w:p>
     <w:p>
@@ -1151,7 +1064,7 @@
         <w:pStyle w:val="MDPI31text"/>
       </w:pPr>
       <w:r>
-        <w:t xml:space="preserve">Risk of bias and applicability were assessed with PROBAST+AI, the updated Prediction model Risk Of Bias ASsessment Tool for regression and AI models, because the included reports predominantly described AI model development and evaluation [30]. The Cochrane RoB 2 tool was not applicable because no included report was a randomised trial [31]. QUADAS-3 was considered but not applied because the corpus comprised model development and evaluation studies rather than a uniform set of fixed index-test accuracy studies; applying one tool consistently preserved comparability across reports [32]. Reporting checklists were not used as a substitute for risk-of-bias assessment.</w:t>
+        <w:t xml:space="preserve">Risk of bias and applicability were assessed with PROBAST+AI, the updated Prediction model Risk Of Bias ASsessment Tool for regression and AI models, because the included reports predominantly described AI model development and evaluation [32]. The Cochrane RoB 2 tool was not applicable because no included report was a randomised trial [33]. QUADAS-3 was considered but not applied because the corpus comprised model development and evaluation studies rather than a uniform set of fixed index-test accuracy studies; applying one tool consistently preserved comparability across reports [34]. Reporting checklists were not used as a substitute for risk-of-bias assessment.</w:t>
       </w:r>
     </w:p>
     <w:p>
@@ -1159,7 +1072,7 @@
         <w:pStyle w:val="MDPI31text"/>
       </w:pPr>
       <w:r>
-        <w:t xml:space="preserve">PROBAST+AI judgements were made separately for model-development quality and for risk of bias in model evaluation across four domains: participants and data sources, predictors, outcome, and analysis. Applicability of the evaluation evidence to the prespecified intended use, the detection or triage of current glaucoma from ONH or retinal imaging, was assessed across the participants and data sources, predictors, and outcome domains. Each domain was rated low, high, or unclear with a report-specific rationale. The overall judgement was high when any domain was high, low only when all domains were low, and unclear otherwise; no numerical quality score was calculated. Appraisal followed the same procedure as data extraction: two reviewers (M.S.A. and M.I.E.-K.G.) independently rated every domain, and disagreements were re-checked by the third and fourth authors (A.K.D. and M.A.S.) and resolved by consensus. Study-level judgements are reported in Table S7.</w:t>
+        <w:t xml:space="preserve">PROBAST+AI judgements were made separately for model-development quality and for risk of bias in model evaluation across four domains: participants and data sources, predictors, outcome, and analysis. Applicability of the evaluation evidence was assessed with PROBAST+AI across the participants and data sources, predictors, and outcome domains against the diagnostic-detection use defined in Section 2.1. Because a low applicability rating for diagnostic detection does not imply applicability to population screening, each report was additionally classified against the population-screening definition (Section 2.1). A report was considered applicable to screening only if it evaluated the model in a sample drawn from the defined screening population and setting, with the model in its triage role and a referral-relevant reference standard. Each domain was rated low, high, or unclear with a report-specific rationale. The overall judgement was high when any domain was high, low only when all domains were low, and unclear otherwise; no numerical quality score was calculated. Appraisal followed the same procedure as data extraction: two reviewers (M.S.A. and M.I.E.-K.G.) independently rated every domain, and disagreements were re-checked by the third and fourth authors (A.K.D. and M.A.S.) and resolved by consensus. Study-level judgements are reported in Table S7.</w:t>
       </w:r>
     </w:p>
     <w:p>
@@ -1184,7 +1097,7 @@
         <w:pStyle w:val="MDPI31text"/>
       </w:pPr>
       <w:r>
-        <w:t xml:space="preserve">Meta-analysis was not performed because the studies were not sufficiently exchangeable [33]: the same public images were reused across reports; units of analysis, labels, and reference standards differed; tasks ranged from binary detection to multiclass staging; early-disease definitions were inconsistent; validation designs and thresholds varied; reconstructable 2 × 2 tables and confidence intervals were often absent; and participant leakage through fellow eyes, repeated visits, or augmented images could not be excluded. Consequently, no pooled accuracy estimate, heterogeneity statistic, funnel plot, or formal certainty-of-evidence rating was produced. The structured narrative synthesis examined whether performance remained credible as reference standards and validation independence became more stringent, and the proportion of reports meeting successive clinical-readiness criteria was summarised graphically.</w:t>
+        <w:t xml:space="preserve">Meta-analysis was not performed because the studies were not sufficiently exchangeable [35]: the same public images were reused across reports; units of analysis, labels, and reference standards differed; tasks ranged from binary detection to multiclass staging; early-disease definitions were inconsistent; validation designs and thresholds varied; reconstructable 2 × 2 tables and confidence intervals were often absent; and participant leakage through fellow eyes, repeated visits, or augmented images could not be excluded. Consequently, no pooled accuracy estimate, heterogeneity statistic, funnel plot, or formal certainty-of-evidence rating was produced. The structured narrative synthesis examined whether performance remained credible as reference standards and validation independence became more stringent, and the proportion of reports meeting individual and combined clinical-readiness criteria was summarised graphically.</w:t>
       </w:r>
     </w:p>
     <w:p>
@@ -1192,7 +1105,25 @@
         <w:pStyle w:val="MDPI31text"/>
       </w:pPr>
       <w:r>
-        <w:t xml:space="preserve">To aid interpretation for health systems, we also illustrated the referral consequences of screening 10,000 adults at a glaucoma prevalence of 3.5%, the global estimate for people aged 40–80 years [2], under three hypothetical combinations of sensitivity and specificity, and contrasted them with an enriched 50% prevalence typical of benchmark datasets. This arithmetic illustration was not prespecified in the protocol, uses no pooled data, and does not estimate the performance of any included model.</w:t>
+        <w:t xml:space="preserve">Early-disease results were classified in two steps. An estimate was </w:t>
+      </w:r>
+      <w:r>
+        <w:rPr>
+          <w:i/>
+        </w:rPr>
+        <w:t xml:space="preserve">extractable</w:t>
+      </w:r>
+      <w:r>
+        <w:t xml:space="preserve"> when discrimination between operationally defined early glaucoma and non-glaucomatous eyes was reported separately. It was </w:t>
+      </w:r>
+      <w:r>
+        <w:rPr>
+          <w:i/>
+        </w:rPr>
+        <w:t xml:space="preserve">credible for clinical inference</w:t>
+      </w:r>
+      <w:r>
+        <w:t xml:space="preserve"> when, in addition, the report had no critical design flaw affecting that estimate, such as complete confounding of case and control sources or unresolved internal inconsistencies in the reported values. To test whether the denominator of 55 influenced the findings, we repeated the headline proportions after excluding reports for which no glaucoma-specific point estimate of identifiable metric type could be transcribed. To aid interpretation for health systems, we also illustrated the referral consequences of screening 10,000 adults at a glaucoma prevalence of 3.5%, the global estimate for people aged 40–80 years [2], under three hypothetical combinations of sensitivity and specificity, and contrasted them with an enriched 50% prevalence typical of benchmark datasets. This arithmetic illustration uses no pooled data and does not estimate the performance of any included model.</w:t>
       </w:r>
     </w:p>
     <w:p>
@@ -1217,7 +1148,7 @@
         <w:pStyle w:val="MDPI31text"/>
       </w:pPr>
       <w:r>
-        <w:t xml:space="preserve">The database searches identified 1426 records (PubMed/MEDLINE, 214; Embase, 187; Scopus, 386; Web of Science, 298; IEEE Xplore, 341). After removal of 486 duplicates, 940 records were screened and 862 were excluded. Of 78 reports sought, 2 could not be retrieved, and 76 were assessed in full. Other methods identified 63 records; after removal of 26 duplicates, 37 were screened, 21 were excluded, 16 reports were sought, 1 could not be retrieved, and 15 were assessed in full. Of the 91 full-text reports assessed, 36 were excluded (Table S2), and 55 were included (Figure 1) [34–88]. Because several reports shared datasets, the included reports are treated as publications rather than independent cohorts.</w:t>
+        <w:t xml:space="preserve">The database searches identified 1426 records (PubMed/MEDLINE, 214; Embase, 187; Scopus, 386; Web of Science, 298; IEEE Xplore, 341). After removal of 486 duplicates, 940 records were screened and 862 were excluded. Of 78 reports sought, 2 could not be retrieved, and 76 were assessed in full. Other methods identified 63 records; after removal of 26 duplicates, 37 were screened, 21 were excluded, 16 reports were sought, 1 could not be retrieved, and 15 were assessed in full. Of the 91 full-text reports assessed, 36 were excluded (Table S2), and 55 were included (Figure 1) [36–90]. Because several reports shared datasets, the included reports are treated as publications rather than independent cohorts.</w:t>
       </w:r>
     </w:p>
     <w:p>
@@ -1336,7 +1267,7 @@
         <w:t xml:space="preserve">n</w:t>
       </w:r>
       <w:r>
-        <w:t xml:space="preserve"> = 25); 42 (76.4%) appeared in 2025–2026, indicating a recent and rapidly expanding evidence base. Publication year was assigned from the journal volume year. Fundus or optic disc photographs were used in 53 reports (96.4%), including cropped ONH images and fundus images processed as hyperspectral representations. OCT contributed to eight reports: six paired OCT with fundus photography, one paired OCT with visual-field probability plots, and one used three-dimensional OCT alone [34,41,42,48,62,68,73,77]. Two reports incorporated visual-field data [34,77], and two used hyperspectral-converted or pseudo-hyperspectral fundus representations [44,72]. Other inputs included clinical variables [55,62], disc/cup contours [43], and dataset metadata [52]. Modalities overlap and therefore do not sum to 55.</w:t>
+        <w:t xml:space="preserve"> = 25); 42 (76.4%) appeared in 2025–2026, indicating a recent and rapidly expanding evidence base. Publication year was assigned from the journal volume year. Fundus or optic disc photographs were used in 53 reports (96.4%), including cropped ONH images and fundus images processed as hyperspectral representations. OCT contributed to eight reports: six paired OCT with fundus photography, one paired OCT with visual-field probability plots, and one used three-dimensional OCT alone [36,43,44,50,64,70,75,79]. Two reports incorporated visual-field data [36,79], and two used hyperspectral-converted or pseudo-hyperspectral fundus representations [46,74]. Other inputs included clinical variables [57,64], disc/cup contours [45], and dataset metadata [54]. Modalities overlap and therefore do not sum to 55.</w:t>
       </w:r>
     </w:p>
     <w:p>
@@ -2205,7 +2136,7 @@
               <w:jc w:val="left"/>
             </w:pPr>
             <w:r>
-              <w:t xml:space="preserve">Two yielded interpretable early-disease discrimination.</w:t>
+              <w:t xml:space="preserve">Two gave an extractable early-disease estimate.</w:t>
             </w:r>
           </w:p>
         </w:tc>
@@ -2226,7 +2157,7 @@
               <w:jc w:val="left"/>
             </w:pPr>
             <w:r>
-              <w:t xml:space="preserve">Separately extractable preperimetric result</w:t>
+              <w:t xml:space="preserve">Early-disease estimate credible for clinical inference</w:t>
             </w:r>
           </w:p>
         </w:tc>
@@ -2242,7 +2173,7 @@
               <w:jc w:val="center"/>
             </w:pPr>
             <w:r>
-              <w:t xml:space="preserve">0 (0.0)</w:t>
+              <w:t xml:space="preserve">1 (1.8)</w:t>
             </w:r>
           </w:p>
         </w:tc>
@@ -2258,7 +2189,7 @@
               <w:jc w:val="left"/>
             </w:pPr>
             <w:r>
-              <w:t xml:space="preserve">Principal clinical evidence gap.</w:t>
+              <w:t xml:space="preserve">The other was confounded by site and internally inconsistent.</w:t>
             </w:r>
           </w:p>
         </w:tc>
@@ -2279,7 +2210,7 @@
               <w:jc w:val="left"/>
             </w:pPr>
             <w:r>
-              <w:t xml:space="preserve">Explanation or transparent biomarker pathway</w:t>
+              <w:t xml:space="preserve">Separately extractable preperimetric result</w:t>
             </w:r>
           </w:p>
         </w:tc>
@@ -2295,7 +2226,7 @@
               <w:jc w:val="center"/>
             </w:pPr>
             <w:r>
-              <w:t xml:space="preserve">12 (21.8)</w:t>
+              <w:t xml:space="preserve">0 (0.0)</w:t>
             </w:r>
           </w:p>
         </w:tc>
@@ -2311,7 +2242,7 @@
               <w:jc w:val="left"/>
             </w:pPr>
             <w:r>
-              <w:t xml:space="preserve">No explanation output validated as a biomarker.</w:t>
+              <w:t xml:space="preserve">Principal clinical evidence gap.</w:t>
             </w:r>
           </w:p>
         </w:tc>
@@ -2332,7 +2263,7 @@
               <w:jc w:val="left"/>
             </w:pPr>
             <w:r>
-              <w:t xml:space="preserve">High PROBAST+AI risk of bias (evaluation)</w:t>
+              <w:t xml:space="preserve">Explanation or transparent biomarker pathway</w:t>
             </w:r>
           </w:p>
         </w:tc>
@@ -2348,7 +2279,7 @@
               <w:jc w:val="center"/>
             </w:pPr>
             <w:r>
-              <w:t xml:space="preserve">51 (92.7)</w:t>
+              <w:t xml:space="preserve">12 (21.8)</w:t>
             </w:r>
           </w:p>
         </w:tc>
@@ -2364,7 +2295,7 @@
               <w:jc w:val="left"/>
             </w:pPr>
             <w:r>
-              <w:t xml:space="preserve">High risk in at least one domain.</w:t>
+              <w:t xml:space="preserve">No explanation output validated as a biomarker.</w:t>
             </w:r>
           </w:p>
         </w:tc>
@@ -2385,7 +2316,7 @@
               <w:jc w:val="left"/>
             </w:pPr>
             <w:r>
-              <w:t xml:space="preserve">High applicability concern (evaluation)</w:t>
+              <w:t xml:space="preserve">High PROBAST+AI risk of bias (evaluation)</w:t>
             </w:r>
           </w:p>
         </w:tc>
@@ -2401,7 +2332,7 @@
               <w:jc w:val="center"/>
             </w:pPr>
             <w:r>
-              <w:t xml:space="preserve">45 (81.8)</w:t>
+              <w:t xml:space="preserve">51 (92.7)</w:t>
             </w:r>
           </w:p>
         </w:tc>
@@ -2417,7 +2348,7 @@
               <w:jc w:val="left"/>
             </w:pPr>
             <w:r>
-              <w:t xml:space="preserve">Mostly driven by participant/data-source mismatch.</w:t>
+              <w:t xml:space="preserve">High risk in at least one domain.</w:t>
             </w:r>
           </w:p>
         </w:tc>
@@ -2438,7 +2369,7 @@
               <w:jc w:val="left"/>
             </w:pPr>
             <w:r>
-              <w:t xml:space="preserve">Low risk of bias and low applicability concern</w:t>
+              <w:t xml:space="preserve">High applicability concern (evaluation)</w:t>
             </w:r>
           </w:p>
         </w:tc>
@@ -2454,6 +2385,59 @@
               <w:jc w:val="center"/>
             </w:pPr>
             <w:r>
+              <w:t xml:space="preserve">45 (81.8)</w:t>
+            </w:r>
+          </w:p>
+        </w:tc>
+        <w:tc>
+          <w:tcPr>
+            <w:tcW w:w="4700" w:type="dxa"/>
+            <w:vAlign w:val="center"/>
+          </w:tcPr>
+          <w:p>
+            <w:pPr>
+              <w:pStyle w:val="MDPI42tablebody"/>
+              <w:spacing w:line="240" w:lineRule="auto"/>
+              <w:jc w:val="left"/>
+            </w:pPr>
+            <w:r>
+              <w:t xml:space="preserve">Mostly driven by participant/data-source mismatch.</w:t>
+            </w:r>
+          </w:p>
+        </w:tc>
+      </w:tr>
+      <w:tr>
+        <w:trPr>
+          <w:cantSplit/>
+        </w:trPr>
+        <w:tc>
+          <w:tcPr>
+            <w:tcW w:w="4260" w:type="dxa"/>
+            <w:vAlign w:val="center"/>
+          </w:tcPr>
+          <w:p>
+            <w:pPr>
+              <w:pStyle w:val="MDPI42tablebody"/>
+              <w:spacing w:line="240" w:lineRule="auto"/>
+              <w:jc w:val="left"/>
+            </w:pPr>
+            <w:r>
+              <w:t xml:space="preserve">Low risk of bias and low applicability concern (diagnostic detection)</w:t>
+            </w:r>
+          </w:p>
+        </w:tc>
+        <w:tc>
+          <w:tcPr>
+            <w:tcW w:w="1500" w:type="dxa"/>
+            <w:vAlign w:val="center"/>
+          </w:tcPr>
+          <w:p>
+            <w:pPr>
+              <w:pStyle w:val="MDPI42tablebody"/>
+              <w:spacing w:line="240" w:lineRule="auto"/>
+              <w:jc w:val="center"/>
+            </w:pPr>
+            <w:r>
               <w:t xml:space="preserve">3 (5.5)</w:t>
             </w:r>
           </w:p>
@@ -2470,7 +2454,60 @@
               <w:jc w:val="left"/>
             </w:pPr>
             <w:r>
-              <w:t xml:space="preserve">Studies closest to clinical relevance.</w:t>
+              <w:t xml:space="preserve">Research or clinically selected cohorts.</w:t>
+            </w:r>
+          </w:p>
+        </w:tc>
+      </w:tr>
+      <w:tr>
+        <w:trPr>
+          <w:cantSplit/>
+        </w:trPr>
+        <w:tc>
+          <w:tcPr>
+            <w:tcW w:w="4260" w:type="dxa"/>
+            <w:vAlign w:val="center"/>
+          </w:tcPr>
+          <w:p>
+            <w:pPr>
+              <w:pStyle w:val="MDPI42tablebody"/>
+              <w:spacing w:line="240" w:lineRule="auto"/>
+              <w:jc w:val="left"/>
+            </w:pPr>
+            <w:r>
+              <w:t xml:space="preserve">Applicable to population screening</w:t>
+            </w:r>
+          </w:p>
+        </w:tc>
+        <w:tc>
+          <w:tcPr>
+            <w:tcW w:w="1500" w:type="dxa"/>
+            <w:vAlign w:val="center"/>
+          </w:tcPr>
+          <w:p>
+            <w:pPr>
+              <w:pStyle w:val="MDPI42tablebody"/>
+              <w:spacing w:line="240" w:lineRule="auto"/>
+              <w:jc w:val="center"/>
+            </w:pPr>
+            <w:r>
+              <w:t xml:space="preserve">0 (0.0)</w:t>
+            </w:r>
+          </w:p>
+        </w:tc>
+        <w:tc>
+          <w:tcPr>
+            <w:tcW w:w="4700" w:type="dxa"/>
+            <w:vAlign w:val="center"/>
+          </w:tcPr>
+          <w:p>
+            <w:pPr>
+              <w:pStyle w:val="MDPI42tablebody"/>
+              <w:spacing w:line="240" w:lineRule="auto"/>
+              <w:jc w:val="left"/>
+            </w:pPr>
+            <w:r>
+              <w:t xml:space="preserve">No screening sample or triage-role evaluation.</w:t>
             </w:r>
           </w:p>
         </w:tc>
@@ -2532,7 +2569,7 @@
         <w:pStyle w:val="MDPI31text"/>
       </w:pPr>
       <w:r>
-        <w:t xml:space="preserve">Thirty-nine reports (70.9%) neither defined nor analysed an early-disease or suspect state. Of the 16 reports making an early-stage, severity, or suspect-related claim, six used an operational mild or early perimetric definition [35,41,42,68,76,77], eight used an author-labelled early or staged category without reproducible criteria, and two analysed a glaucoma-suspect class as a risk state. Four of the six operational definitions applied a visual-field mean-deviation threshold of approximately −6 dB, and two used a named or report-defined visual-field staging system. No report provided separately extractable performance for preperimetric glaucoma.</w:t>
+        <w:t xml:space="preserve">Thirty-nine reports (70.9%) neither defined nor analysed an early-disease or suspect state. Of the 16 reports making an early-stage, severity, or suspect-related claim, six used an operational mild or early perimetric definition [37,43,44,70,78,79], eight used an author-labelled early or staged category without reproducible criteria, and two analysed a glaucoma-suspect class as a risk state. Four of the six operational definitions applied a visual-field mean-deviation threshold of approximately −6 dB, and two used a named or report-defined visual-field staging system. No report provided separately extractable performance for preperimetric glaucoma.</w:t>
       </w:r>
     </w:p>
     <w:p>
@@ -2540,7 +2577,7 @@
         <w:pStyle w:val="MDPI31text"/>
       </w:pPr>
       <w:r>
-        <w:t xml:space="preserve">Only two reports provided directly interpretable discrimination of early disease from non-glaucomatous eyes. A DeiT model developed in the Ocular Hypertension Treatment Study (OHTS) cohort reported an area under the receiver operating characteristic curve (AUC) of 0.87 (95% confidence interval [CI], 0.80–0.91) for early glaucoma defined by mean deviation [35]. A second study reported an AUC of 1.00 in an explicitly mild cohort, but all glaucoma images came from one clinic whereas most controls came from public datasets, creating severe site-by-outcome confounding, and values differed between the abstract and tables [76]. Two further reports used the same 300-examination GAMMA benchmark for three-level grading [41,42], and two multimodal clinical reports included staged participants without a separately extractable early-stage estimate [68,77]. The six operationally defined reports therefore did not constitute six independent validations of early-glaucoma detection.</w:t>
+        <w:t xml:space="preserve">Two reports provided an extractable estimate of early-disease discrimination against non-glaucomatous eyes, but only one was credible for clinical inference. A DeiT model developed in the Ocular Hypertension Treatment Study (OHTS) cohort reported an area under the receiver operating characteristic curve (AUC) of 0.87 (95% confidence interval [CI], 0.80–0.91) for early glaucoma defined by mean deviation [37]. A second study reported an AUC of 1.00 in an explicitly mild cohort, but all glaucoma images came from one clinic whereas most controls came from public datasets, creating severe site-by-outcome confounding, and values differed between the abstract and tables; this estimate was therefore classified as extractable but not credible for clinical inference [78]. Two further reports used the same 300-examination GAMMA benchmark for three-level grading [43,44], and two multimodal clinical reports included staged participants without a separately extractable early-stage estimate [70,79]. The six operationally defined reports therefore did not constitute six independent validations of early-glaucoma detection.</w:t>
       </w:r>
     </w:p>
     <w:p>
@@ -2557,7 +2594,7 @@
         <w:pStyle w:val="MDPI31text"/>
       </w:pPr>
       <w:r>
-        <w:t xml:space="preserve">Nine reports (16.4%) evaluated glaucoma detection on a distinct data source: eight used external or cross-dataset evaluation and one used leave-one-domain-out evaluation [35,37,50,59,64,65,67,69,78]. Only four combined distinct-source evaluation with confirmed participant-level separation. Of the remaining reports, 32 used a same-source held-out or fixed partition, 8 internal resampling only, 4 an unclear internal allocation, and 2 development-derived or validation-only results. Cross-dataset testing often changed both the image distribution and the outcome definition, so it assessed combined domain and label shift rather than performance against a uniform reference standard. Confidence intervals accompanied the extracted headline estimate in only six reports (10.9%; Table S4).</w:t>
+        <w:t xml:space="preserve">Nine reports (16.4%) evaluated glaucoma detection on a distinct data source: eight used external or cross-dataset evaluation and one used leave-one-domain-out evaluation [37,39,52,61,66,67,69,71,80]. Only four combined distinct-source evaluation with confirmed participant-level separation. Of the remaining reports, 32 used a same-source held-out or fixed partition, 8 internal resampling only, 4 an unclear internal allocation, and 2 development-derived or validation-only results. Cross-dataset testing often changed both the image distribution and the outcome definition, so it assessed combined domain and label shift rather than performance against a uniform reference standard. Confidence intervals accompanied the extracted headline estimate in only six reports (10.9%; Table S4).</w:t>
       </w:r>
     </w:p>
     <w:p>
@@ -2565,7 +2602,7 @@
         <w:pStyle w:val="MDPI31text"/>
       </w:pPr>
       <w:r>
-        <w:t xml:space="preserve">Internal estimates varied widely across non-exchangeable tasks and datasets, and several near-perfect values arose from image-level splits of public or aggregated datasets, small test sets, synthetically augmented samples, or unreconciled denominators. More rigorous external testing exposed marked domain effects. In a foundation-model comparison, internal AUCs of 0.958 (DINOv2) and 0.940 (RETFound) fell to 0.625 and 0.558, respectively, on the external PAPILA dataset [64]. In a transformer comparison using ONH crops, the best internal balanced accuracy of 97.32% fell to 78.78–88.84% across three external datasets [37].</w:t>
+        <w:t xml:space="preserve">Internal estimates varied widely across non-exchangeable tasks and datasets, and several near-perfect values arose from image-level splits of public or aggregated datasets, small test sets, synthetically augmented samples, or unreconciled denominators. More rigorous external testing exposed marked domain effects. In a foundation-model comparison, internal AUCs of 0.958 (DINOv2) and 0.940 (RETFound) fell to 0.625 and 0.558, respectively, on the external PAPILA dataset [66]. In a transformer comparison using ONH crops, the best internal balanced accuracy of 97.32% fell to 78.78–88.84% across three external datasets [39].</w:t>
       </w:r>
     </w:p>
     <w:p>
@@ -2573,7 +2610,7 @@
         <w:pStyle w:val="MDPI31text"/>
       </w:pPr>
       <w:r>
-        <w:t xml:space="preserve">Performance did not always degrade. A participant-separated study of individuals of African ancestry reported visit-level AUCs of 0.925 internally and 0.920 in an external Chinese dataset (REFUGE-1) [69]. A multidomain foundation model reported AUCs of approximately 0.88–0.99 under leave-one-domain-out evaluation, although source labels were heterogeneous [65], and a diffusion-augmented Swin model reported an internal AUC of 0.992 and zero-shot AUCs of 0.806–0.981 across ten external public datasets [78]. Cross-source performance is therefore achievable, but differences in labels, prevalence, devices, and recruitment pathways limit direct comparison.</w:t>
+        <w:t xml:space="preserve">Performance did not always degrade. A participant-separated study of individuals of African ancestry reported visit-level AUCs of 0.925 internally and 0.920 in an external Chinese dataset (REFUGE-1) [71]. A multidomain foundation model reported AUCs of approximately 0.88–0.99 under leave-one-domain-out evaluation, although source labels were heterogeneous [67], and a diffusion-augmented Swin model reported an internal AUC of 0.992 and zero-shot AUCs of 0.806–0.981 across ten external public datasets [80]. Cross-source performance is therefore achievable, but differences in labels, prevalence, devices, and recruitment pathways limit direct comparison.</w:t>
       </w:r>
     </w:p>
     <w:p>
@@ -2581,7 +2618,7 @@
         <w:pStyle w:val="MDPI31text"/>
       </w:pPr>
       <w:r>
-        <w:t xml:space="preserve">OCT and multimodal models also reported high discrimination, predominantly under internal evaluation. A paired OCT–visual-field transformer reported an AUC of 0.939 [34], and a participant-level cross-validated three-dimensional OCT model an AUC of 0.942 [48]. In a participant-held-out clinical cohort, a fundus-plus-OCT foundation model achieved an AUC of 0.94, compared with 0.93 for OCT and 0.86 for photographs alone [68], and a fundus–visual-field–OCT model reported an AUC of 0.981 under participant-grouped five-fold cross-validation [77]. In this small, internally evaluated body of evidence, multimodal models outperformed their single-modality comparators, but independent confirmation is lacking.</w:t>
+        <w:t xml:space="preserve">OCT and multimodal models also reported high discrimination, predominantly under internal evaluation. A paired OCT–visual-field transformer reported an AUC of 0.939 [36], and a participant-level cross-validated three-dimensional OCT model an AUC of 0.942 [50]. In a participant-held-out clinical cohort, a fundus-plus-OCT foundation model achieved an AUC of 0.94, compared with 0.93 for OCT and 0.86 for photographs alone [70], and a fundus–visual-field–OCT model reported an AUC of 0.981 under participant-grouped five-fold cross-validation [79]. In this small, internally evaluated body of evidence, multimodal models outperformed their single-modality comparators, but independent confirmation is lacking.</w:t>
       </w:r>
     </w:p>
     <w:p>
@@ -2739,7 +2776,7 @@
               <w:jc w:val="left"/>
             </w:pPr>
             <w:r>
-              <w:t xml:space="preserve">Fan et al., 2023 [35]</w:t>
+              <w:t xml:space="preserve">Fan et al., 2023 [37]</w:t>
             </w:r>
           </w:p>
         </w:tc>
@@ -2808,7 +2845,7 @@
               <w:jc w:val="left"/>
             </w:pPr>
             <w:r>
-              <w:t xml:space="preserve">Alayón et al., 2023 [37]</w:t>
+              <w:t xml:space="preserve">Alayón et al., 2023 [39]</w:t>
             </w:r>
           </w:p>
         </w:tc>
@@ -2877,7 +2914,7 @@
               <w:jc w:val="left"/>
             </w:pPr>
             <w:r>
-              <w:t xml:space="preserve">Wang et al., 2023 [41]</w:t>
+              <w:t xml:space="preserve">Wang et al., 2023 [43]</w:t>
             </w:r>
           </w:p>
         </w:tc>
@@ -2946,7 +2983,7 @@
               <w:jc w:val="left"/>
             </w:pPr>
             <w:r>
-              <w:t xml:space="preserve">Wu et al., 2023 [42]</w:t>
+              <w:t xml:space="preserve">Wu et al., 2023 [44]</w:t>
             </w:r>
           </w:p>
         </w:tc>
@@ -2994,7 +3031,7 @@
               <w:jc w:val="left"/>
             </w:pPr>
             <w:r>
-              <w:t xml:space="preserve">Well-defined challenge hold-out; cohort overlaps [41]; not an external clinical cohort.</w:t>
+              <w:t xml:space="preserve">Well-defined challenge hold-out; cohort overlaps [43]; not an external clinical cohort.</w:t>
             </w:r>
           </w:p>
         </w:tc>
@@ -3015,7 +3052,7 @@
               <w:jc w:val="left"/>
             </w:pPr>
             <w:r>
-              <w:t xml:space="preserve">Das et al., 2025 [50]</w:t>
+              <w:t xml:space="preserve">Das et al., 2025 [52]</w:t>
             </w:r>
           </w:p>
         </w:tc>
@@ -3084,7 +3121,7 @@
               <w:jc w:val="left"/>
             </w:pPr>
             <w:r>
-              <w:t xml:space="preserve">Prakash and Vinoth Kumar, 2025 [59]</w:t>
+              <w:t xml:space="preserve">Prakash and Vinoth Kumar, 2025 [61]</w:t>
             </w:r>
           </w:p>
         </w:tc>
@@ -3153,7 +3190,7 @@
               <w:jc w:val="left"/>
             </w:pPr>
             <w:r>
-              <w:t xml:space="preserve">Hou et al., 2026 [64]</w:t>
+              <w:t xml:space="preserve">Hou et al., 2026 [66]</w:t>
             </w:r>
           </w:p>
         </w:tc>
@@ -3222,7 +3259,7 @@
               <w:jc w:val="left"/>
             </w:pPr>
             <w:r>
-              <w:t xml:space="preserve">Abramovich et al., 2026 [65]</w:t>
+              <w:t xml:space="preserve">Abramovich et al., 2026 [67]</w:t>
             </w:r>
           </w:p>
         </w:tc>
@@ -3291,7 +3328,7 @@
               <w:jc w:val="left"/>
             </w:pPr>
             <w:r>
-              <w:t xml:space="preserve">Bolo et al., 2026 [67]</w:t>
+              <w:t xml:space="preserve">Bolo et al., 2026 [69]</w:t>
             </w:r>
           </w:p>
         </w:tc>
@@ -3360,7 +3397,7 @@
               <w:jc w:val="left"/>
             </w:pPr>
             <w:r>
-              <w:t xml:space="preserve">Chuter et al., 2026 [68]</w:t>
+              <w:t xml:space="preserve">Chuter et al., 2026 [70]</w:t>
             </w:r>
           </w:p>
         </w:tc>
@@ -3429,7 +3466,7 @@
               <w:jc w:val="left"/>
             </w:pPr>
             <w:r>
-              <w:t xml:space="preserve">Li et al., 2026 [69]</w:t>
+              <w:t xml:space="preserve">Li et al., 2026 [71]</w:t>
             </w:r>
           </w:p>
         </w:tc>
@@ -3498,7 +3535,7 @@
               <w:jc w:val="left"/>
             </w:pPr>
             <w:r>
-              <w:t xml:space="preserve">Bouris et al., 2026 [76]</w:t>
+              <w:t xml:space="preserve">Bouris et al., 2026 [78]</w:t>
             </w:r>
           </w:p>
         </w:tc>
@@ -3546,7 +3583,7 @@
               <w:jc w:val="left"/>
             </w:pPr>
             <w:r>
-              <w:t xml:space="preserve">Explicit early disease; near-complete site-by-class confounding.</w:t>
+              <w:t xml:space="preserve">Explicit early disease; near-complete site-by-class confounding; early estimate not credible for clinical inference.</w:t>
             </w:r>
           </w:p>
         </w:tc>
@@ -3567,7 +3604,7 @@
               <w:jc w:val="left"/>
             </w:pPr>
             <w:r>
-              <w:t xml:space="preserve">Hasan et al., 2026 [77]</w:t>
+              <w:t xml:space="preserve">Hasan et al., 2026 [79]</w:t>
             </w:r>
           </w:p>
         </w:tc>
@@ -3636,7 +3673,7 @@
               <w:jc w:val="left"/>
             </w:pPr>
             <w:r>
-              <w:t xml:space="preserve">Wu et al., 2026 [78]</w:t>
+              <w:t xml:space="preserve">Wu et al., 2026 [80]</w:t>
             </w:r>
           </w:p>
         </w:tc>
@@ -3713,7 +3750,7 @@
         <w:pStyle w:val="MDPI31text"/>
       </w:pPr>
       <w:r>
-        <w:t xml:space="preserve">Fundus models most often represented ONH and retinal information implicitly. Explicit pathways included disc and cup contours, segmentation-derived vCDR, neuroretinal-rim morphology, OCT RNFL structure, visual-field information, and spectral-band or pseudo-hyperspectral signals. Several models used a vCDR threshold as the diagnostic target itself [45,56,58,67]. Such designs make the decision pathway transparent but become circular when the same threshold is then presented as evidence that the model has identified glaucoma.</w:t>
+        <w:t xml:space="preserve">Fundus models most often represented ONH and retinal information implicitly. Explicit pathways included disc and cup contours, segmentation-derived vCDR, neuroretinal-rim morphology, OCT RNFL structure, visual-field information, and spectral-band or pseudo-hyperspectral signals. Several models used a vCDR threshold as the diagnostic target itself [47,58,60,69]. Such designs make the decision pathway transparent but become circular when the same threshold is then presented as evidence that the model has identified glaucoma.</w:t>
       </w:r>
     </w:p>
     <w:p>
@@ -3721,7 +3758,7 @@
         <w:pStyle w:val="MDPI31text"/>
       </w:pPr>
       <w:r>
-        <w:t xml:space="preserve">Twelve reports provided an explanation method or a transparent biomarker pathway [35,43,47,48,53,56,62,75,82,84–86], including transformer attention maps, attention rollout, Grad-CAM and related visualisations, layer-wise relevance propagation, intrinsic superpixel tokens, and segmentation-to-vCDR pathways. Most explanations were qualitative and highlighted the disc, cup, rim, or peripapillary region; one report presented simulated examples [62], whereas another quantified insertion–deletion behaviour [86]. No report independently validated an explanation output as a glaucoma biomarker. Agreement between a heat map and a plausible anatomical region does not establish model reasoning, causal relevance, or transportability.</w:t>
+        <w:t xml:space="preserve">Twelve reports provided an explanation method or a transparent biomarker pathway [37,45,49,50,55,58,64,77,84,86–88], including transformer attention maps, attention rollout, Grad-CAM and related visualisations, layer-wise relevance propagation, intrinsic superpixel tokens, and segmentation-to-vCDR pathways. Most explanations were qualitative and highlighted the disc, cup, rim, or peripapillary region; one report presented simulated examples [64], whereas another quantified insertion–deletion behaviour [88]. No report independently validated an explanation output as a glaucoma biomarker. Agreement between a heat map and a plausible anatomical region does not establish model reasoning, causal relevance, or transportability.</w:t>
       </w:r>
     </w:p>
     <w:p>
@@ -3738,7 +3775,15 @@
         <w:pStyle w:val="MDPI31text"/>
       </w:pPr>
       <w:r>
-        <w:t xml:space="preserve">Under PROBAST+AI, 51 of 55 reports (92.7%) had a high overall risk of bias in model evaluation, 1 was unclear, and 3 were low. Model-development quality raised high concern in 52 reports (94.5%) and low concern in 3. Applicability concern for the evaluation evidence was high in 45 reports (81.8%), unclear in 7, and low in 3 (Figure 2). The three reports rated low in all three assessments were the OHTS-based transformer study, the participant-level multimodal study in the Diagnostic Innovations in Glaucoma Study/African Descent and Glaucoma Evaluation Study (DIGS/ADAGES) cohort, and the Primary Open-Angle African American Glaucoma Genetics (POAAGG) study [35,68,69].</w:t>
+        <w:t xml:space="preserve">Under PROBAST+AI, 51 of 55 reports (92.7%) had a high overall risk of bias in model evaluation, 1 was unclear, and 3 were low. Model-development quality raised high concern in 52 reports (94.5%) and low concern in 3. Applicability concern for diagnostic detection was high in 45 reports (81.8%), unclear in 7, and low in 3 (Figure 2). The three reports rated low in all three assessments were the OHTS-based transformer study, the participant-level multimodal study in the Diagnostic Innovations in Glaucoma Study/African Descent and Glaucoma Evaluation Study (DIGS/ADAGES) cohort, and the Primary Open-Angle African American Glaucoma Genetics (POAAGG) study [37,70,71].</w:t>
+      </w:r>
+    </w:p>
+    <w:p>
+      <w:pPr>
+        <w:pStyle w:val="MDPI31text"/>
+      </w:pPr>
+      <w:r>
+        <w:t xml:space="preserve">No report was applicable to population screening as defined in Section 2.1. None evaluated a model in a sample drawn from adults without known glaucoma in primary care, optometry, community, or teleophthalmology settings with the model in its triage role. The three reports rated low for applicability concern drew participants from a randomised trial of people with ocular hypertension (OHTS), from glaucoma research cohorts (DIGS/ADAGES), and from a case–control genetics study (POAAGG). Their low ratings therefore apply to diagnostic detection in eye-care settings, not to population screening. Seven reports used images from EyePACS/AIROGS/JustRAIGS, which originate from a diabetic-retinopathy screening programme, but analysed them retrospectively as benchmark data, often as class-balanced subsets or in combination with other repositories [42,45,59,68,75,80,90].</w:t>
       </w:r>
     </w:p>
     <w:p>
@@ -3838,7 +3883,7 @@
         <w:t xml:space="preserve">c</w:t>
       </w:r>
       <w:r>
-        <w:t xml:space="preserve">) applicability of the evaluation evidence to the intended use (detection or triage of current glaucoma from optic nerve head or retinal imaging). Bars show the percentage of reports rated low, unclear, or high; numbers are report counts. The overall rating was high when any domain was high, low only when every domain was low, and unclear otherwise.</w:t>
+        <w:t xml:space="preserve">) applicability of the evaluation evidence to diagnostic detection of current glaucoma in eye-care settings; applicability to population screening was assessed separately (Section 3.7). Bars show the percentage of reports rated low, unclear, or high; numbers are report counts. The overall rating was high when any domain was high, low only when every domain was low, and unclear otherwise.</w:t>
       </w:r>
     </w:p>
     <w:p>
@@ -3847,7 +3892,7 @@
         <w:spacing w:before="240"/>
       </w:pPr>
       <w:r>
-        <w:t xml:space="preserve">3.8. Distance from Benchmark Performance to Clinical Readiness</w:t>
+        <w:t xml:space="preserve">3.8. Individual and Combined Criteria for Clinical Readiness</w:t>
       </w:r>
     </w:p>
     <w:p>
@@ -3855,7 +3900,15 @@
         <w:pStyle w:val="MDPI31text"/>
       </w:pPr>
       <w:r>
-        <w:t xml:space="preserve">Figure 3 summarises how few reports met successive criteria for clinical readiness. Although all 55 reports claimed glaucoma detection or staging, 13 (23.6%) used a clinical or adjudicated reference standard, 9 (16.4%) tested models on a distinct data source, 8 (14.5%) confirmed participant-level separation, and 4 (7.3%) combined participant-level separation with distinct-source evaluation. Only two reports (3.6%) met all three conditions, and three (5.5%) had both low risk of bias and low applicability concern. No report provided a separately extractable preperimetric result or a prospective or implementation evaluation.</w:t>
+        <w:t xml:space="preserve">Figure 3 compares the proportion of reports meeting individual criteria relevant to clinical readiness with the proportion meeting combinations of them; the criteria are not nested. Thirteen reports (23.6%) used a clinical or adjudicated reference standard, 9 (16.4%) tested models on a distinct data source, and 8 (14.5%) confirmed participant-level separation. Four (7.3%) combined participant-level separation with distinct-source evaluation, and only two (3.6%) also used a clinical reference standard. Three reports (5.5%) had low risk of bias and low applicability concern for diagnostic detection. One report (1.8%) provided a credible early-disease estimate. No report provided a preperimetric result, was applicable to population screening, or described a prospective or implementation evaluation.</w:t>
+      </w:r>
+    </w:p>
+    <w:p>
+      <w:pPr>
+        <w:pStyle w:val="MDPI31text"/>
+      </w:pPr>
+      <w:r>
+        <w:t xml:space="preserve">In the sensitivity analysis, six reports were excluded because no glaucoma-specific point estimate of identifiable metric type could be transcribed [43,52,68,83,87,88]. In the remaining 49 reports, no headline proportion changed by more than 2.2 percentage points (Table S8). The findings therefore do not depend on the inclusion of these reports.</w:t>
       </w:r>
     </w:p>
     <w:p>
@@ -3868,7 +3921,7 @@
       <w:r>
         <w:drawing>
           <wp:inline xmlns:a="http://schemas.openxmlformats.org/drawingml/2006/main" xmlns:pic="http://schemas.openxmlformats.org/drawingml/2006/picture">
-            <wp:extent cx="6120000" cy="3088073"/>
+            <wp:extent cx="6120000" cy="3649541"/>
             <wp:docPr id="3" name="Picture 3"/>
             <wp:cNvGraphicFramePr>
               <a:graphicFrameLocks noChangeAspect="1"/>
@@ -3889,7 +3942,7 @@
                   <pic:spPr>
                     <a:xfrm>
                       <a:off x="0" y="0"/>
-                      <a:ext cx="6120000" cy="3088073"/>
+                      <a:ext cx="6120000" cy="3649541"/>
                     </a:xfrm>
                     <a:prstGeom prst="rect"/>
                   </pic:spPr>
@@ -3912,7 +3965,7 @@
         <w:t xml:space="preserve">Figure 3.</w:t>
       </w:r>
       <w:r>
-        <w:t xml:space="preserve"> Proportion of the 55 included reports meeting successive criteria for clinical readiness. Lighter bars show single criteria and darker bars show combinations of criteria. Distinct-source evaluation comprises external or cross-dataset evaluation and leave-one-domain-out evaluation. Counts are reports, not independent cohorts.</w:t>
+        <w:t xml:space="preserve"> Proportion of the 55 included reports meeting individual and combined criteria relevant to clinical readiness. The criteria are not nested; lighter bars show individual criteria and darker bars show combinations of criteria. Distinct-source evaluation comprises external or cross-dataset evaluation and leave-one-domain-out evaluation. Counts are reports, not independent cohorts.</w:t>
       </w:r>
     </w:p>
     <w:p>
@@ -3937,7 +3990,7 @@
         <w:pStyle w:val="MDPI31text"/>
       </w:pPr>
       <w:r>
-        <w:t xml:space="preserve">This review shows that transformer-based glaucoma detection is a rapidly expanding but clinically immature field. Technical discrimination was often high, but the credibility of the evidence was limited by repeated reuse of public datasets, weak or heterogeneous labels, infrequent participant-level separation, and predominantly internal evaluation. The 55 reports should therefore not be read as 55 independent replications. High risk of bias in 92.7% of evaluations and high applicability concern in 81.8% explain why headline accuracy and readiness for screening diverged: only two reports combined a clinical reference standard, participant-level separation, and evaluation on a distinct data source.</w:t>
+        <w:t xml:space="preserve">This review shows that transformer-based glaucoma detection is a rapidly expanding but clinically immature field. Technical discrimination was often high, but the credibility of the evidence was limited by repeated reuse of public datasets, weak or heterogeneous labels, infrequent participant-level separation, and predominantly internal evaluation. The 55 reports should therefore not be read as 55 independent replications. High risk of bias in 92.7% of evaluations and high applicability concern in 81.8% explain why headline accuracy and readiness for screening diverged: only two reports combined a clinical reference standard, participant-level separation, and evaluation on a distinct data source, and none was applicable to population screening.</w:t>
       </w:r>
     </w:p>
     <w:p>
@@ -3945,7 +3998,7 @@
         <w:pStyle w:val="MDPI31text"/>
       </w:pPr>
       <w:r>
-        <w:t xml:space="preserve">These findings qualify the high pooled accuracy reported by earlier meta-analyses of glaucoma AI, which estimated a pooled sensitivity of 0.92 and specificity of 0.93 for fundus-based deep learning [23], and extend evidence that glaucoma AI studies are incompletely reported [24]. They also mirror patterns observed across medical imaging AI, where most studies are retrospective, few are externally validated, and claims frequently exceed the supporting designs [19,21,89]. The most informative transformer studies illustrate both the potential and the fragility of performance. The OHTS-based model and the POAAGG study combined clinically meaningful outcomes with participant separation, and the latter maintained an AUC near 0.92 externally [35,69]. Conversely, two models with excellent internal results deteriorated substantially on new datasets [37,64]. These contrasts are compatible with population and device shift, but also with changes in labels, recruitment, image quality, and disease spectrum, and they cannot be reduced to a single estimate of transformer generalisability.</w:t>
+        <w:t xml:space="preserve">These findings qualify the high pooled accuracy reported by earlier meta-analyses of glaucoma AI, which estimated a pooled sensitivity of 0.92 and specificity of 0.93 for fundus-based deep learning [23], and extend evidence that glaucoma AI studies are incompletely reported [26]. They also mirror patterns observed across medical imaging AI, where most studies are retrospective, few are externally validated, and claims frequently exceed the supporting designs [19,21,91]. The most informative transformer studies illustrate both the potential and the fragility of performance. The OHTS-based model and the POAAGG study combined clinically meaningful outcomes with participant separation, and the latter maintained an AUC near 0.92 externally [37,71]. Conversely, two models with excellent internal results deteriorated substantially on new datasets [39,66]. These contrasts are compatible with population and device shift, but also with changes in labels, recruitment, image quality, and disease spectrum, and they cannot be reduced to a single estimate of transformer generalisability.</w:t>
       </w:r>
     </w:p>
     <w:p>
@@ -3962,7 +4015,7 @@
         <w:pStyle w:val="MDPI31text"/>
       </w:pPr>
       <w:r>
-        <w:t xml:space="preserve">The main clinical gap is definitional as well as statistical. Only six reports operationalised mild or early perimetric disease, only two provided interpretable early-disease discrimination, and none reported a separately extractable preperimetric result. Suspect status, ocular hypertension, referable ONH morphology, preperimetric glaucoma, and mild perimetric glaucoma are not interchangeable targets [1,8–11]; merging them changes the reference standard, expected prevalence, management consequences, and difficulty of discrimination. Yet early detection is the very reason for screening: treatment prevents further loss but cannot restore lost function.</w:t>
+        <w:t xml:space="preserve">The main clinical gap is definitional as well as statistical. Only six reports operationalised mild or early perimetric disease, two provided an extractable early-disease estimate, only one of these was credible for clinical inference, and none reported a preperimetric result. Suspect status, ocular hypertension, referable ONH morphology, preperimetric glaucoma, and mild perimetric glaucoma are not interchangeable targets [1,8–11]; merging them changes the reference standard, expected prevalence, management consequences, and difficulty of discrimination. Yet early detection is the very reason for screening: treatment prevents further loss but cannot restore lost function.</w:t>
       </w:r>
     </w:p>
     <w:p>
@@ -3970,7 +4023,7 @@
         <w:pStyle w:val="MDPI31text"/>
       </w:pPr>
       <w:r>
-        <w:t xml:space="preserve">The two interpretable estimates show why target definition alone is not sufficient. The OHTS-based AUC of 0.87 was tied to an explicit mean-deviation criterion [35], whereas the AUC of 1.00 reported in another mild cohort was highly vulnerable to site-by-outcome confounding and internal inconsistency [76], a recognised mechanism by which models learn acquisition source rather than disease [20]. Neither result establishes preperimetric screening performance. Future studies should prespecify whether the target is risk or suspect status, referable morphology, preperimetric glaucoma, mild perimetric glaucoma, or any established glaucoma; apply reproducible structural and functional criteria; and report performance for each state separately.</w:t>
+        <w:t xml:space="preserve">The two extractable estimates show why target definition alone is not sufficient. The OHTS-based AUC of 0.87 was tied to an explicit mean-deviation criterion [37], whereas the AUC of 1.00 reported in another mild cohort was highly vulnerable to site-by-outcome confounding and internal inconsistency [78], a recognised mechanism by which models learn acquisition source rather than disease [20]. Neither result establishes preperimetric screening performance. Future studies should prespecify whether the target is risk or suspect status, referable morphology, preperimetric glaucoma, mild perimetric glaucoma, or any established glaucoma; apply reproducible structural and functional criteria; and report performance for each state separately.</w:t>
       </w:r>
     </w:p>
     <w:p>
@@ -3987,7 +4040,7 @@
         <w:pStyle w:val="MDPI31text"/>
       </w:pPr>
       <w:r>
-        <w:t xml:space="preserve">The current evidence supports model development and carefully bounded triage research, not autonomous population screening. A clinically evaluable system requires a fixed intended use and care pathway, representative or consecutive sampling, a defensible reference standard, participant-level separation, a frozen model and threshold, calibration, confidence intervals, operating characteristics relevant to screening, and transparent subgroup, error, and failure analyses. Reporting should follow STARD-AI for diagnostic accuracy studies and TRIPOD+AI for prediction model development and evaluation [90,91].</w:t>
+        <w:t xml:space="preserve">The current evidence supports model development and carefully bounded triage research, not autonomous population screening. A clinically evaluable system requires a fixed intended use and care pathway, representative or consecutive sampling, a defensible reference standard, participant-level separation, a frozen model and threshold, calibration, confidence intervals, operating characteristics relevant to screening, and transparent subgroup, error, and failure analyses. Reporting should follow STARD-AI for diagnostic accuracy studies and TRIPOD+AI for prediction model development and evaluation [92,93].</w:t>
       </w:r>
     </w:p>
     <w:p>
@@ -3995,7 +4048,7 @@
         <w:pStyle w:val="MDPI31text"/>
       </w:pPr>
       <w:r>
-        <w:t xml:space="preserve">External validation should answer a clinical transport question rather than simply exchange one public repository for another. A real-world multicentre evaluation of a glaucomatous optic neuropathy detection system demonstrates that testing across heterogeneous clinical settings is feasible [92]. Geographic, temporal, device, and care-setting evaluations should use a frozen model and threshold and, wherever possible, a consistent target condition; where labels differ, authors should state that observed changes combine domain shift and reference-standard shift. Established validation frameworks require assessment of discrimination, calibration, and clinical utility rather than AUC alone [93,94]. Prospective work should then proceed in stages: silent evaluation within the intended workflow; assessment of calibration, handling of ungradable images, failure modes, and subgroup performance; comparison with current care; and, when justified, evaluation of referral rates, time to diagnosis, resource use, and patient outcomes [22]. The pathway followed by autonomous AI for diabetic retinopathy, culminating in a prospective pivotal trial in primary care, provides a concrete precedent [12].</w:t>
+        <w:t xml:space="preserve">External validation should answer a clinical transport question rather than simply exchange one public repository for another. A real-world multicentre evaluation of a glaucomatous optic neuropathy detection system demonstrates that testing across heterogeneous clinical settings is feasible [94]. Geographic, temporal, device, and care-setting evaluations should use a frozen model and threshold and, wherever possible, a consistent target condition; where labels differ, authors should state that observed changes combine domain shift and reference-standard shift. Established validation frameworks require assessment of discrimination, calibration, and clinical utility rather than AUC alone [95,96]. Prospective work should then proceed in stages: silent evaluation within the intended workflow; assessment of calibration, handling of ungradable images, failure modes, and subgroup performance; comparison with current care; and, when justified, evaluation of referral rates, time to diagnosis, resource use, and patient outcomes [22]. The pathway followed by autonomous AI for diabetic retinopathy, culminating in a prospective pivotal trial in primary care, provides a concrete precedent [12].</w:t>
       </w:r>
     </w:p>
     <w:p>
@@ -4012,7 +4065,7 @@
         <w:pStyle w:val="MDPI31text"/>
       </w:pPr>
       <w:r>
-        <w:t xml:space="preserve">Accuracy measured in enriched datasets translates poorly into the workload a screening programme would face. Most benchmark datasets contain similar numbers of glaucomatous and healthy eyes, whereas the global prevalence of glaucoma among people aged 40–80 years is approximately 3.5% [2]. Table 4 illustrates the consequence. With a sensitivity of 0.90 and a specificity of 0.95, performance that many included reports exceeded internally, screening 10,000 adults would detect 315 of 350 people with glaucoma but generate 483 false-positive referrals, so that only 39.5% of referred people would have the disease, compared with 94.7% in a balanced benchmark. A loss of performance on new data, of the size observed in the external evaluations reviewed here, would roughly double (scenario B) or triple (scenario C) the number of false-positive referrals and reduce the positive predictive value to 15–24%. For health systems with limited specialist capacity, these referrals carry costs in clinic time, patient anxiety, and delayed care for others; the missed cases carry the irreversible cost of undetected disease.</w:t>
+        <w:t xml:space="preserve">Accuracy measured in enriched datasets translates poorly into the workload a screening programme would face. Most benchmark datasets contain similar numbers of glaucomatous and healthy eyes, whereas the global prevalence of glaucoma among people aged 40–80 years is approximately 3.5% [2]. Table 4 illustrates the consequence with hypothetical values. In scenario A (sensitivity 0.90, specificity 0.95), screening 10,000 adults would detect 315 of 350 people with glaucoma but generate 483 false-positive referrals, so that only 39.5% of referred people would have the disease, compared with 94.7% in a balanced benchmark. In scenarios B and C, lower sensitivity and specificity would roughly double or triple the number of false-positive referrals and reduce the positive predictive value to 15–24%. These scenarios are arithmetic illustrations chosen to span plausible values. They are not estimates of the performance, or of the loss of performance, of any included model. For health systems with limited specialist capacity, these referrals carry costs in clinic time, patient anxiety, and delayed care for others; the missed cases carry the irreversible cost of undetected disease.</w:t>
       </w:r>
     </w:p>
     <w:p>
@@ -4078,7 +4131,7 @@
               <w:rPr>
                 <w:b/>
               </w:rPr>
-              <w:t xml:space="preserve">Scenario (sensitivity/specificity)</w:t>
+              <w:t xml:space="preserve">Hypothetical scenario (sensitivity/specificity)</w:t>
             </w:r>
           </w:p>
         </w:tc>
@@ -4231,7 +4284,7 @@
               <w:jc w:val="left"/>
             </w:pPr>
             <w:r>
-              <w:t xml:space="preserve">A: benchmark-level performance (0.90/0.95)</w:t>
+              <w:t xml:space="preserve">A (0.90/0.95)</w:t>
             </w:r>
           </w:p>
         </w:tc>
@@ -4348,7 +4401,7 @@
               <w:jc w:val="left"/>
             </w:pPr>
             <w:r>
-              <w:t xml:space="preserve">B: moderate loss of performance (0.85/0.90)</w:t>
+              <w:t xml:space="preserve">B (0.85/0.90)</w:t>
             </w:r>
           </w:p>
         </w:tc>
@@ -4465,7 +4518,7 @@
               <w:jc w:val="left"/>
             </w:pPr>
             <w:r>
-              <w:t xml:space="preserve">C: loss of performance under domain shift (0.75/0.85)</w:t>
+              <w:t xml:space="preserve">C (0.75/0.85)</w:t>
             </w:r>
           </w:p>
         </w:tc>
@@ -4581,7 +4634,7 @@
         <w:pStyle w:val="MDPI31text"/>
       </w:pPr>
       <w:r>
-        <w:t xml:space="preserve">Equity is a second health-system concern. Thirty-two reports (58.2%) relied solely on international public repositories that were not assembled to represent a defined screening population, and most datasets were reused repeatedly. Performance in under-represented populations, on low-cost or portable cameras, and in settings with high rates of ungradable images therefore remains largely untested. The POAAGG study, which developed and externally evaluated a model in individuals of African ancestry, a group at high risk of primary open-angle glaucoma, shows that population-specific evaluation is achievable [69]. Health-technology assessment, procurement, and regulatory decisions should require evidence from the population, device, and care setting in which a system is to be used, rather than from benchmark repositories.</w:t>
+        <w:t xml:space="preserve">Equity is a second health-system concern. Thirty-two reports (58.2%) relied solely on international public repositories that were not assembled to represent a defined screening population, and most datasets were reused repeatedly. Performance in under-represented populations, on low-cost or portable cameras, and in settings with high rates of ungradable images therefore remains largely untested. The POAAGG study, which developed and externally evaluated a model in individuals of African ancestry, a group at high risk of primary open-angle glaucoma, shows that population-specific evaluation is achievable [71]. Health-technology assessment, procurement, and regulatory decisions should require evidence from the population, device, and care setting in which a system is to be used, rather than from benchmark repositories.</w:t>
       </w:r>
     </w:p>
     <w:p>
@@ -4732,7 +4785,7 @@
               <w:jc w:val="left"/>
             </w:pPr>
             <w:r>
-              <w:t xml:space="preserve">Operational mild/early definition, 6; preperimetric result, 0</w:t>
+              <w:t xml:space="preserve">Operational mild/early definition, 6; credible early-disease estimate, 1; preperimetric result, 0</w:t>
             </w:r>
           </w:p>
         </w:tc>
@@ -4838,7 +4891,7 @@
               <w:jc w:val="left"/>
             </w:pPr>
             <w:r>
-              <w:t xml:space="preserve">High participant/data-source risk of bias, 51</w:t>
+              <w:t xml:space="preserve">High participant/data-source risk of bias, 51; applicable to population screening, 0</w:t>
             </w:r>
           </w:p>
         </w:tc>
@@ -5148,7 +5201,7 @@
         <w:pStyle w:val="MDPI31text"/>
       </w:pPr>
       <w:r>
-        <w:t xml:space="preserve">The reviewed systems represented clinically plausible information, including disc and cup geometry, neuroretinal-rim configuration, RNFL structure, and structure–function relationships. Explicit segmentation-to-vCDR pathways were more traceable than unconstrained classifiers. In a small number of internally evaluated studies, multimodal models reported higher discrimination than single-modality comparators [68,77], but independent confirmation is lacking, and any incremental value must be weighed against acquisition cost, access to OCT and perimetry in primary care, and failure when a modality is missing.</w:t>
+        <w:t xml:space="preserve">The reviewed systems represented clinically plausible information, including disc and cup geometry, neuroretinal-rim configuration, RNFL structure, and structure–function relationships. Explicit segmentation-to-vCDR pathways were more traceable than unconstrained classifiers. In a small number of internally evaluated studies, multimodal models reported higher discrimination than single-modality comparators [70,79], but independent confirmation is lacking, and any incremental value must be weighed against acquisition cost, access to OCT and perimetry in primary care, and failure when a modality is missing.</w:t>
       </w:r>
     </w:p>
     <w:p>
@@ -5156,7 +5209,7 @@
         <w:pStyle w:val="MDPI31text"/>
       </w:pPr>
       <w:r>
-        <w:t xml:space="preserve">Interpretability must not be confused with biomarker validation. Attention maps, Grad-CAM, attention rollout, and related displays can support error analysis and hypothesis generation, but a map centred on the optic disc does not show that the highlighted feature drove a stable decision, is glaucoma-specific, or generalises across devices and populations, consistent with broader critiques of post hoc explainability in health care [95]. Circularity is especially problematic when a model trained against a vCDR threshold is presented as validating vCDR. Biomarker-oriented studies should evaluate repeatability, association with an adjudicated outcome, incremental value beyond established measurements, robustness to image quality and domain shift, and, where relevant, longitudinal relation to progression.</w:t>
+        <w:t xml:space="preserve">Interpretability must not be confused with biomarker validation. Attention maps, Grad-CAM, attention rollout, and related displays can support error analysis and hypothesis generation, but a map centred on the optic disc does not show that the highlighted feature drove a stable decision, is glaucoma-specific, or generalises across devices and populations, consistent with broader critiques of post hoc explainability in health care [97]. Circularity is especially problematic when a model trained against a vCDR threshold is presented as validating vCDR. Biomarker-oriented studies should evaluate repeatability, association with an adjudicated outcome, incremental value beyond established measurements, robustness to image quality and domain shift, and, where relevant, longitudinal relation to progression.</w:t>
       </w:r>
     </w:p>
     <w:p>
@@ -5181,7 +5234,7 @@
         <w:pStyle w:val="MDPI31text"/>
       </w:pPr>
       <w:r>
-        <w:t xml:space="preserve">Several limitations should be considered. The restriction to full-length, English-language journal reports may have omitted relevant non-English work and conference proceedings, which are a common publication route in computer vision; however, conference papers seldom report the participant-level partitioning and reference-standard details required for clinical appraisal. Google Scholar screening was limited to the first 200 relevance-ranked results. The field is evolving rapidly, and reports published after 15 July 2026 were not captured. Missing denominators, partition details, and glaucoma-specific metrics were recorded as not reported rather than imputed. Synthesis at report level and extensive dataset reuse prevented estimation of the total number of independent participants. Finally, heterogeneous targets, reference standards, units of analysis, and validation designs precluded meta-analysis, formal assessment of publication bias, and formal certainty grading; the conclusions therefore concern the maturity and credibility of the evidence rather than a pooled measure of diagnostic accuracy.</w:t>
+        <w:t xml:space="preserve">Several limitations should be considered. The restriction to full-length, English-language journal reports may have omitted relevant non-English work and conference proceedings, which are a common publication route in computer vision; however, conference papers seldom report the participant-level partitioning and reference-standard details required for clinical appraisal. Google Scholar screening was limited to the first 200 relevance-ranked results. The field is evolving rapidly, and reports published after 15 July 2026 were not captured. Missing denominators, partition details, and glaucoma-specific metrics were recorded as not reported rather than imputed. Synthesis at report level and extensive dataset reuse prevented estimation of the total number of independent participants. Applicability to screening could be judged only from the sampling frames described in the reports, and several analyses were added after protocol registration; these are identified as post hoc in Section 2.1. Finally, heterogeneous targets, reference standards, units of analysis, and validation designs precluded meta-analysis, formal assessment of publication bias, and formal certainty grading; the conclusions therefore concern the maturity and credibility of the evidence rather than a pooled measure of diagnostic accuracy.</w:t>
       </w:r>
     </w:p>
     <w:p>
@@ -5197,7 +5250,7 @@
         <w:pStyle w:val="MDPI31text"/>
       </w:pPr>
       <w:r>
-        <w:t xml:space="preserve">Transformer-based models can achieve high discrimination for glaucoma from fundus, ONH, OCT, and multimodal imaging, but the current evidence is dominated by internally evaluated, repeatedly reused benchmarks with heterogeneous labels and limited participant-level separation. Only six of 55 reports operationalised mild or early perimetric disease, two provided interpretable early-disease discrimination, none reported preperimetric performance, and none validated an explanation output as a glaucoma biomarker. Only three reports combined low risk of bias with low applicability concern, and none evaluated a screening pathway prospectively. Transformer-based glaucoma detection is therefore not yet ready for screening deployment. Progress now depends less on new architectures than on better evidence: prespecified early-disease definitions, clinical reference standards, participant-level data splits, frozen external and prospective validation, calibration and screening-relevant operating characteristics, and evaluation of effects on referral pathways, costs, and patient outcomes.</w:t>
+        <w:t xml:space="preserve">Transformer-based models can achieve high discrimination for glaucoma from fundus, ONH, OCT, and multimodal imaging, but the current evidence is dominated by internally evaluated, repeatedly reused benchmarks with heterogeneous labels and limited participant-level separation. Only six of 55 reports operationalised mild or early perimetric disease, one provided a credible early-disease estimate, none reported preperimetric performance, and none validated an explanation output as a glaucoma biomarker. Three reports combined low risk of bias with low applicability concern for diagnostic detection, but none was applicable to population screening or evaluated a screening pathway prospectively. Transformer-based glaucoma detection is therefore not yet ready for screening deployment. Progress now depends less on new architectures than on better evidence: prespecified early-disease definitions, clinical reference standards, participant-level data splits, frozen external and prospective validation, calibration and screening-relevant operating characteristics, and evaluation of effects on referral pathways, costs, and patient outcomes.</w:t>
       </w:r>
     </w:p>
     <w:p>
@@ -5212,7 +5265,7 @@
         <w:t xml:space="preserve">Supplementary Materials: </w:t>
       </w:r>
       <w:r>
-        <w:t xml:space="preserve">The following supporting information can be downloaded at: https://www.mdpi.com/article/doi/s1, Table S1: Electronic search strategies and supplementary search methods; Table S2: Principal reasons for exclusion at full-text assessment; Table S3: Characteristics of the 55 included reports; Table S4: Validation design and diagnostic performance as reported; Table S5: Early-disease definitions, reference standards, imaging biomarkers, and explanation methods; Table S6: Recurring public dataset families and linked reports; Table S7: PROBAST+AI judgements for model development, model evaluation, and applicability, with report-specific rationales. The completed PRISMA 2020 checklist is provided as a separate file.</w:t>
+        <w:t xml:space="preserve">The following supporting information can be downloaded at: https://www.mdpi.com/article/doi/s1, Table S1: Electronic search strategies and supplementary search methods; Table S2: Principal reasons for exclusion at full-text assessment; Table S3: Characteristics of the 55 included reports; Table S4: Validation design and diagnostic performance as reported; Table S5: Early-disease definitions, reference standards, imaging biomarkers, and explanation methods; Table S6: Recurring public dataset families and linked reports; Table S7: PROBAST+AI judgements for model development, model evaluation, and applicability, with report-specific rationales; Table S8: Sensitivity analysis of headline proportions. The completed PRISMA 2020 checklist is provided as a separate file.</w:t>
       </w:r>
     </w:p>
     <w:p>
@@ -5287,7 +5340,7 @@
         <w:t xml:space="preserve">Data Availability Statement: </w:t>
       </w:r>
       <w:r>
-        <w:t xml:space="preserve">All report-level extracted data, harmonised definitions, validation tiers, and PROBAST+AI judgements with rationales are provided in the Supplementary Materials (Tables S1–S7). A machine-readable version of the extraction dataset and the list of individual reports excluded at full-text assessment, with the reason for each exclusion, are available from the corresponding author on reasonable request.</w:t>
+        <w:t xml:space="preserve">All report-level extracted data, harmonised definitions, validation tiers, and PROBAST+AI judgements with rationales are provided in the Supplementary Materials (Tables S1–S8). A machine-readable version of the extraction dataset and the list of individual reports excluded at full-text assessment, with the reason for each exclusion, are available from the corresponding author on reasonable request.</w:t>
       </w:r>
     </w:p>
     <w:p>
@@ -7709,6 +7762,86 @@
           <w:color w:val="000000" w:themeColor="text1"/>
         </w:rPr>
         <w:t>, 420. https://doi.org/10.3390/biomedicines13020420.</w:t>
+      </w:r>
+    </w:p>
+    <w:p>
+      <w:pPr>
+        <w:pStyle w:val="MDPI81references"/>
+        <w:numPr>
+          <w:ilvl w:val="0"/>
+          <w:numId w:val="0"/>
+        </w:numPr>
+        <w:ind w:left="425"/>
+      </w:pPr>
+      <w:r>
+        <w:t xml:space="preserve">Meedeniya, D.; Shyamalee, T.; Lim, G.; Yogarajah, P. Glaucoma Identification with Retinal Fundus Images Using Deep Learning: Systematic Review. </w:t>
+      </w:r>
+      <w:r>
+        <w:rPr>
+          <w:i/>
+        </w:rPr>
+        <w:t xml:space="preserve">Inform. Med. Unlocked</w:t>
+      </w:r>
+      <w:r>
+        <w:t xml:space="preserve"> </w:t>
+      </w:r>
+      <w:r>
+        <w:rPr>
+          <w:b/>
+        </w:rPr>
+        <w:t xml:space="preserve">2025</w:t>
+      </w:r>
+      <w:r>
+        <w:t xml:space="preserve">, </w:t>
+      </w:r>
+      <w:r>
+        <w:rPr>
+          <w:i/>
+        </w:rPr>
+        <w:t xml:space="preserve">56</w:t>
+      </w:r>
+      <w:r>
+        <w:t xml:space="preserve">, 101644. https://doi.org/10.1016/j.imu.2025.101644.</w:t>
+      </w:r>
+    </w:p>
+    <w:p>
+      <w:pPr>
+        <w:pStyle w:val="MDPI81references"/>
+        <w:numPr>
+          <w:ilvl w:val="0"/>
+          <w:numId w:val="0"/>
+        </w:numPr>
+        <w:ind w:left="425"/>
+      </w:pPr>
+      <w:r>
+        <w:t xml:space="preserve">Saidah, S.; Rizal, A.; Wijayanto, I. Artificial Intelligence in Glaucoma Detection System Based on Fundus Images. </w:t>
+      </w:r>
+      <w:r>
+        <w:rPr>
+          <w:i/>
+        </w:rPr>
+        <w:t xml:space="preserve">PeerJ Comput. Sci.</w:t>
+      </w:r>
+      <w:r>
+        <w:t xml:space="preserve"> </w:t>
+      </w:r>
+      <w:r>
+        <w:rPr>
+          <w:b/>
+        </w:rPr>
+        <w:t xml:space="preserve">2026</w:t>
+      </w:r>
+      <w:r>
+        <w:t xml:space="preserve">, </w:t>
+      </w:r>
+      <w:r>
+        <w:rPr>
+          <w:i/>
+        </w:rPr>
+        <w:t xml:space="preserve">12</w:t>
+      </w:r>
+      <w:r>
+        <w:t xml:space="preserve">, e3705. https://doi.org/10.7717/peerj-cs.3705.</w:t>
       </w:r>
     </w:p>
     <w:p>
@@ -11783,7 +11916,7 @@
         <w:sz w:val="16"/>
         <w:szCs w:val="16"/>
       </w:rPr>
-      <w:t xml:space="preserve">Healthcare </w:t>
+      <w:t xml:space="preserve"/>
     </w:r>
     <w:r>
       <w:rPr>
@@ -11793,7 +11926,7 @@
         <w:sz w:val="16"/>
         <w:szCs w:val="16"/>
       </w:rPr>
-      <w:t>2026</w:t>
+      <w:t/>
     </w:r>
     <w:r>
       <w:rPr>
@@ -11802,7 +11935,7 @@
         <w:sz w:val="16"/>
         <w:szCs w:val="16"/>
       </w:rPr>
-      <w:t>,</w:t>
+      <w:t/>
     </w:r>
     <w:r>
       <w:rPr>
@@ -11812,7 +11945,7 @@
         <w:sz w:val="16"/>
         <w:szCs w:val="16"/>
       </w:rPr>
-      <w:t xml:space="preserve"> 14</w:t>
+      <w:t xml:space="preserve"/>
     </w:r>
     <w:r>
       <w:rPr>
@@ -11821,7 +11954,7 @@
         <w:sz w:val="16"/>
         <w:szCs w:val="16"/>
       </w:rPr>
-      <w:t xml:space="preserve">, </w:t>
+      <w:t xml:space="preserve"/>
     </w:r>
     <w:r>
       <w:rPr>
@@ -11830,7 +11963,7 @@
         <w:sz w:val="16"/>
         <w:szCs w:val="16"/>
       </w:rPr>
-      <w:t>x</w:t>
+      <w:t/>
     </w:r>
     <w:r>
       <w:rPr>
@@ -11844,7 +11977,7 @@
         <w:sz w:val="16"/>
         <w:szCs w:val="16"/>
       </w:rPr>
-      <w:t>https://doi.org/10.3390/xxxxx</w:t>
+      <w:t/>
     </w:r>
   </w:p>
 </w:ftr>
@@ -11907,39 +12040,39 @@
         <w:i/>
         <w:sz w:val="16"/>
       </w:rPr>
-      <w:t xml:space="preserve">Healthcare </w:t>
+      <w:t xml:space="preserve">Healthcare</w:t>
     </w:r>
     <w:r>
       <w:rPr>
         <w:b/>
         <w:sz w:val="16"/>
       </w:rPr>
-      <w:t>2026</w:t>
+      <w:t/>
     </w:r>
     <w:r>
       <w:rPr>
         <w:sz w:val="16"/>
       </w:rPr>
-      <w:t>,</w:t>
+      <w:t/>
     </w:r>
     <w:r>
       <w:rPr>
         <w:i/>
         <w:sz w:val="16"/>
       </w:rPr>
-      <w:t xml:space="preserve"> 14</w:t>
+      <w:t xml:space="preserve"/>
     </w:r>
     <w:r>
       <w:rPr>
         <w:sz w:val="16"/>
       </w:rPr>
-      <w:t xml:space="preserve">, x </w:t>
+      <w:t xml:space="preserve"/>
     </w:r>
     <w:r>
       <w:rPr>
         <w:sz w:val="16"/>
       </w:rPr>
-      <w:t>FOR PEER REVIEW</w:t>
+      <w:t/>
     </w:r>
     <w:r>
       <w:rPr>

</xml_diff>

<commit_message>
Correct S53 glaucoma-class AUC and recompute sensitivity analysis
Record the source-reported glaucoma-class AUC of 1.00 for Santo et al.;
return it to the sensitivity set (n = 50; maximum change 1.8 points);
state that the remaining exclusions reflect the extraction record rather
than a confirmed absence of estimates in the source reports.

Co-Authored-By: Claude Opus 5.5 <noreply@anthropic.com>
Claude-Session: https://claude.ai/code/session_01XhsrtZoNnNZHM2jxbhbhEo
</commit_message>
<xml_diff>
--- a/submission/1_Manuscript_Healthcare.docx
+++ b/submission/1_Manuscript_Healthcare.docx
@@ -1123,7 +1123,7 @@
         <w:t xml:space="preserve">credible for clinical inference</w:t>
       </w:r>
       <w:r>
-        <w:t xml:space="preserve"> when, in addition, the report had no critical design flaw affecting that estimate, such as complete confounding of case and control sources or unresolved internal inconsistencies in the reported values. To test whether the denominator of 55 influenced the findings, we repeated the headline proportions after excluding reports for which no glaucoma-specific point estimate of identifiable metric type could be transcribed. To aid interpretation for health systems, we also illustrated the referral consequences of screening 10,000 adults at a glaucoma prevalence of 3.5%, the global estimate for people aged 40–80 years [2], under three hypothetical combinations of sensitivity and specificity, and contrasted them with an enriched 50% prevalence typical of benchmark datasets. This arithmetic illustration uses no pooled data and does not estimate the performance of any included model.</w:t>
+        <w:t xml:space="preserve"> when, in addition, the report had no critical design flaw affecting that estimate, such as complete confounding of case and control sources or unresolved internal inconsistencies in the reported values. To test whether the denominator of 55 influenced the findings, we repeated the headline proportions after excluding reports for which the review's extraction dataset did not record a glaucoma-specific point estimate of identifiable metric type. To aid interpretation for health systems, we also illustrated the referral consequences of screening 10,000 adults at a glaucoma prevalence of 3.5%, the global estimate for people aged 40–80 years [2], under three hypothetical combinations of sensitivity and specificity, and contrasted them with an enriched 50% prevalence typical of benchmark datasets. This arithmetic illustration uses no pooled data and does not estimate the performance of any included model.</w:t>
       </w:r>
     </w:p>
     <w:p>
@@ -3908,7 +3908,7 @@
         <w:pStyle w:val="MDPI31text"/>
       </w:pPr>
       <w:r>
-        <w:t xml:space="preserve">In the sensitivity analysis, six reports were excluded because no glaucoma-specific point estimate of identifiable metric type could be transcribed [76,85,101,116,120,121]. In the remaining 49 reports, no headline proportion changed by more than 2.2 percentage points (Table S8). The findings therefore do not depend on the inclusion of these reports.</w:t>
+        <w:t xml:space="preserve">In the sensitivity analysis, five reports were excluded because the extraction dataset did not record a glaucoma-specific point estimate of identifiable metric type [76,85,101,116,120]; this reflects the completeness of the extraction record, not a confirmed absence of such estimates in the source reports. In the remaining 50 reports, no headline proportion changed by more than 1.8 percentage points (Table S8). The findings therefore do not depend on the inclusion of these reports.</w:t>
       </w:r>
     </w:p>
     <w:p>

</xml_diff>

<commit_message>
Record S48 stage results and base sensitivity rule on source reporting
Add SGViT-Net accuracy 86.44% and AUC 94.49% (LMG dataset); define the
sensitivity-set rule by what the source papers report, leaving only S33
excluded (n = 54; maximum change 0.6 points); align Section 3.8, Table S8
note, and cover letter.

Co-Authored-By: Claude Opus 5.5 <noreply@anthropic.com>
Claude-Session: https://claude.ai/code/session_01XhsrtZoNnNZHM2jxbhbhEo
</commit_message>
<xml_diff>
--- a/submission/1_Manuscript_Healthcare.docx
+++ b/submission/1_Manuscript_Healthcare.docx
@@ -1123,7 +1123,7 @@
         <w:t xml:space="preserve">credible for clinical inference</w:t>
       </w:r>
       <w:r>
-        <w:t xml:space="preserve"> when, in addition, the report had no critical design flaw affecting that estimate, such as complete confounding of case and control sources or unresolved internal inconsistencies in the reported values. To test whether the denominator of 55 influenced the findings, we repeated the headline proportions after excluding reports for which the review's extraction dataset did not record a glaucoma-specific point estimate of identifiable metric type. To aid interpretation for health systems, we also illustrated the referral consequences of screening 10,000 adults at a glaucoma prevalence of 3.5%, the global estimate for people aged 40–80 years [2], under three hypothetical combinations of sensitivity and specificity, and contrasted them with an enriched 50% prevalence typical of benchmark datasets. This arithmetic illustration uses no pooled data and does not estimate the performance of any included model.</w:t>
+        <w:t xml:space="preserve"> when, in addition, the report had no critical design flaw affecting that estimate, such as complete confounding of case and control sources or unresolved internal inconsistencies in the reported values. To test whether the denominator of 55 influenced the findings, we repeated the headline proportions after excluding reports whose source publication did not report a glaucoma-specific point estimate of identifiable metric type. To aid interpretation for health systems, we also illustrated the referral consequences of screening 10,000 adults at a glaucoma prevalence of 3.5%, the global estimate for people aged 40–80 years [2], under three hypothetical combinations of sensitivity and specificity, and contrasted them with an enriched 50% prevalence typical of benchmark datasets. This arithmetic illustration uses no pooled data and does not estimate the performance of any included model.</w:t>
       </w:r>
     </w:p>
     <w:p>
@@ -3908,7 +3908,7 @@
         <w:pStyle w:val="MDPI31text"/>
       </w:pPr>
       <w:r>
-        <w:t xml:space="preserve">In the sensitivity analysis, five reports were excluded because the extraction dataset did not record a glaucoma-specific point estimate of identifiable metric type [76,85,101,116,120]; this reflects the completeness of the extraction record, not a confirmed absence of such estimates in the source reports. In the remaining 50 reports, no headline proportion changed by more than 1.8 percentage points (Table S8). The findings therefore do not depend on the inclusion of these reports.</w:t>
+        <w:t xml:space="preserve">All included reports except one published glaucoma-specific results of identifiable metric type; the basis for each report is given in Table S4. The exception reported glaucoma-stage values without identifying the metric [101]. Excluding it in the sensitivity analysis changed no headline proportion by more than 0.6 percentage points (Table S8; n = 54), so the findings do not depend on this report.</w:t>
       </w:r>
     </w:p>
     <w:p>

</xml_diff>